<commit_message>
Update Project 1 report DOCX with Task 5 and full pipeline figures
Co-authored-by: tathevve <tathevve@users.noreply.github.com>
</commit_message>
<xml_diff>
--- a/Image_Processing_Project1_Report.docx
+++ b/Image_Processing_Project1_Report.docx
@@ -10,7 +10,8 @@
         <w:rPr>
           <w:rFonts w:ascii="Times New Roman" w:hAnsi="Times New Roman"/>
           <w:b/>
-          <w:sz w:val="32"/>
+          <w:i w:val="0"/>
+          <w:sz w:val="28"/>
         </w:rPr>
         <w:t>CS 260 / CS 371 — Image Processing</w:t>
       </w:r>
@@ -22,10 +23,11 @@
       <w:r>
         <w:rPr>
           <w:rFonts w:ascii="Times New Roman" w:hAnsi="Times New Roman"/>
+          <w:b/>
           <w:i w:val="0"/>
-          <w:sz w:val="22"/>
+          <w:sz w:val="24"/>
         </w:rPr>
-        <w:t>Project 1 Report</w:t>
+        <w:t>Project 1 Report: Rows of Armenian Text in Stone Inscriptions</w:t>
       </w:r>
     </w:p>
     <w:p>
@@ -35,19 +37,7 @@
       <w:r>
         <w:rPr>
           <w:rFonts w:ascii="Times New Roman" w:hAnsi="Times New Roman"/>
-          <w:i w:val="0"/>
-          <w:sz w:val="22"/>
-        </w:rPr>
-        <w:t>Rows of Armenian Text in Stone Inscriptions</w:t>
-      </w:r>
-    </w:p>
-    <w:p>
-      <w:pPr>
-        <w:jc w:val="center"/>
-      </w:pPr>
-      <w:r>
-        <w:rPr>
-          <w:rFonts w:ascii="Times New Roman" w:hAnsi="Times New Roman"/>
+          <w:b w:val="0"/>
           <w:i w:val="0"/>
           <w:sz w:val="22"/>
         </w:rPr>
@@ -61,6 +51,7 @@
       <w:r>
         <w:rPr>
           <w:rFonts w:ascii="Times New Roman" w:hAnsi="Times New Roman"/>
+          <w:b w:val="0"/>
           <w:i/>
           <w:sz w:val="22"/>
         </w:rPr>
@@ -74,8 +65,9 @@
       <w:r>
         <w:rPr>
           <w:rFonts w:ascii="Times New Roman" w:hAnsi="Times New Roman"/>
+          <w:b w:val="0"/>
           <w:i/>
-          <w:sz w:val="22"/>
+          <w:sz w:val="20"/>
         </w:rPr>
         <w:t>Individual submission</w:t>
       </w:r>
@@ -89,51 +81,47 @@
       </w:r>
     </w:p>
     <w:p>
-      <w:pPr>
-        <w:spacing w:after="120"/>
-      </w:pPr>
       <w:r>
         <w:rPr>
           <w:rFonts w:ascii="Times New Roman" w:hAnsi="Times New Roman"/>
           <w:sz w:val="22"/>
         </w:rPr>
-        <w:t>This project implements and analyzes the assigned ImageJ pipeline for detecting and enhancing Armenian inscriptions on stone monuments (tapanakars and khachkars). Because Armenian letterforms are dominated by vertical strokes, the pipeline emphasizes directional vertical-edge extraction, morphological cleaning, spectral bandpass filtering, skeletonization, and Hough-transform-based estimation of text-row positions.</w:t>
+        <w:t>This project implements and analyzes the assigned ImageJ pipeline for detecting / enhancing Armenian inscriptions on stone monuments (tapanakars and khachkars). Armenian letterforms rely heavily on vertical strokes; therefore the pipeline emphasizes directional vertical-edge extraction, morphological cleaning, spectral bandpass filtering, skeletonization, and Hough-based estimation of text-row positions.</w:t>
       </w:r>
     </w:p>
     <w:p>
-      <w:pPr>
-        <w:spacing w:after="120"/>
-      </w:pPr>
       <w:r>
         <w:rPr>
           <w:rFonts w:ascii="Times New Roman" w:hAnsi="Times New Roman"/>
           <w:sz w:val="22"/>
         </w:rPr>
-        <w:t>The report follows the official step numbering (Steps 0–16). Tasks 2–4 evaluate Steps 2, 5, and 10 by comparing final-stage outputs with each step included versus omitted. Task 5 discusses Bandpass parameters in Step 11. Task 6 proposes an algorithm for Step 16.</w:t>
+        <w:t>The report uses the official assignment numbering (Steps 0–16). Tasks 2–4 study Steps 2, 5, and 10 via with/without comparisons. Task 5 studies Bandpass parameters in Step 11. Task 6 proposes an algorithm for Step 16.</w:t>
       </w:r>
     </w:p>
     <w:p>
-      <w:pPr>
-        <w:spacing w:after="120"/>
-      </w:pPr>
       <w:r>
         <w:rPr>
           <w:rFonts w:ascii="Times New Roman" w:hAnsi="Times New Roman"/>
           <w:sz w:val="22"/>
         </w:rPr>
-        <w:t>Primary comparison figures use the skeletonized image S08 and the corresponding Hough accumulator (Hough of S08), because these stages summarize how earlier choices affect row-detection readiness. Source images and intermediate stages are retained in the project shared-drive folders.</w:t>
+        <w:t>Different monument photographs were used across Tasks 2, 3, and 4 (as encouraged by the assignment’s multi-image design). Within each task, the with/without runs are intended as the same pipeline on that task’s chosen photograph. A complete default-parameter pipeline for one monument (Image 1) is also included from original through Hough.</w:t>
       </w:r>
     </w:p>
     <w:p>
-      <w:pPr>
-        <w:spacing w:after="120"/>
-      </w:pPr>
+      <w:r>
+        <w:rPr>
+          <w:rFonts w:ascii="Times New Roman" w:hAnsi="Times New Roman"/>
+          <w:b/>
+          <w:sz w:val="22"/>
+        </w:rPr>
+        <w:t xml:space="preserve">Source links (fill in): </w:t>
+      </w:r>
       <w:r>
         <w:rPr>
           <w:rFonts w:ascii="Times New Roman" w:hAnsi="Times New Roman"/>
           <w:sz w:val="22"/>
         </w:rPr>
-        <w:t>IMPORTANT: Replace [Your Full Name] above, and add the source URL(s) of your original monument photograph(s) here: [SOURCE LINK].</w:t>
+        <w:t>Image 1 original: [URL]. Task 2 original: [URL]. Task 3 original: [URL]. Task 4 original: [URL].</w:t>
       </w:r>
     </w:p>
     <w:p>
@@ -141,19 +129,7 @@
         <w:pStyle w:val="Heading1"/>
       </w:pPr>
       <w:r>
-        <w:t>2. Task 1 — Purpose of Each Pipeline Step (Official Steps 0–16)</w:t>
-      </w:r>
-    </w:p>
-    <w:p>
-      <w:pPr>
-        <w:spacing w:after="120"/>
-      </w:pPr>
-      <w:r>
-        <w:rPr>
-          <w:rFonts w:ascii="Times New Roman" w:hAnsi="Times New Roman"/>
-          <w:sz w:val="22"/>
-        </w:rPr>
-        <w:t>The following descriptions match the assignment menu commands and parameters.</w:t>
+        <w:t>2. Task 1 — Purpose of Each Official Step (0–16)</w:t>
       </w:r>
     </w:p>
     <w:p>
@@ -170,7 +146,7 @@
           <w:rFonts w:ascii="Times New Roman" w:hAnsi="Times New Roman"/>
           <w:sz w:val="22"/>
         </w:rPr>
-        <w:t>Select an image of a tombstone, khachkar, or other monument with Armenian inscriptions. Deliverables: original file and source link.</w:t>
+        <w:t>Select a tombstone/khachkar/monument image with Armenian inscriptions. Deliverable: original file + source link.</w:t>
       </w:r>
     </w:p>
     <w:p>
@@ -180,14 +156,14 @@
           <w:b/>
           <w:sz w:val="22"/>
         </w:rPr>
-        <w:t xml:space="preserve">Step 1 — Scale and grayscale (S00). </w:t>
+        <w:t xml:space="preserve">Step 1 — Scale &amp; grayscale (S00). </w:t>
       </w:r>
       <w:r>
         <w:rPr>
           <w:rFonts w:ascii="Times New Roman" w:hAnsi="Times New Roman"/>
           <w:sz w:val="22"/>
         </w:rPr>
-        <w:t>Scale the image to width 400 pixels (Image → Scale…) and convert to 8-bit grayscale. Purpose: standardize resolution and reduce computation while preserving major structure.</w:t>
+        <w:t>Scale width to 400 px; convert to 8-bit. Standardizes size and reduces computation.</w:t>
       </w:r>
     </w:p>
     <w:p>
@@ -204,7 +180,7 @@
           <w:rFonts w:ascii="Times New Roman" w:hAnsi="Times New Roman"/>
           <w:sz w:val="22"/>
         </w:rPr>
-        <w:t>Apply Process → Filters → Mean… with radius 1.0 to S00. Purpose: suppress high-frequency stone-grain noise before derivative filtering. Trade-off: slight blurring of the finest strokes.</w:t>
+        <w:t>Mean filter, radius 1.0 on S00. Suppresses high-frequency stone grain before derivatives; may slightly blur fine strokes.</w:t>
       </w:r>
     </w:p>
     <w:p>
@@ -221,7 +197,7 @@
           <w:rFonts w:ascii="Times New Roman" w:hAnsi="Times New Roman"/>
           <w:sz w:val="22"/>
         </w:rPr>
-        <w:t>Duplicate S00 as S01 and convolve with the 3×3 kernel [1 0 −1; 2 0 −2; 1 0 −1]. Purpose: emphasize vertical boundaries (horizontal intensity gradients) consistent with Armenian vertical strokes.</w:t>
+        <w:t>Convolve with [1 0 −1; 2 0 −2; 1 0 −1]. Emphasizes vertical boundaries (horizontal gradients).</w:t>
       </w:r>
     </w:p>
     <w:p>
@@ -238,7 +214,7 @@
           <w:rFonts w:ascii="Times New Roman" w:hAnsi="Times New Roman"/>
           <w:sz w:val="22"/>
         </w:rPr>
-        <w:t>Duplicate S00 as S02 and convolve with [−1 0 1; −2 0 2; −1 0 1]. Purpose: complementary vertical-edge response (sign-flipped kernel). This is not a horizontal-edge (Sobel-y) kernel; it captures the opposite polarity of the same directional family.</w:t>
+        <w:t>Convolve with [−1 0 1; −2 0 2; −1 0 1]. Complementary vertical-edge polarity (not a horizontal Sobel-y kernel).</w:t>
       </w:r>
     </w:p>
     <w:p>
@@ -248,14 +224,14 @@
           <w:b/>
           <w:sz w:val="22"/>
         </w:rPr>
-        <w:t xml:space="preserve">Step 5 — Translation of S01 and S02. </w:t>
+        <w:t xml:space="preserve">Step 5 — Translate S01/S02. </w:t>
       </w:r>
       <w:r>
         <w:rPr>
           <w:rFonts w:ascii="Times New Roman" w:hAnsi="Times New Roman"/>
           <w:sz w:val="22"/>
         </w:rPr>
-        <w:t>Translate S01 1 pixel right and S02 1 pixel left (Image → Transform → Translate…). Purpose: compensate the spatial offset of asymmetric 3×3 kernels before combination.</w:t>
+        <w:t>S01 +1 px right, S02 −1 px left. Compensates asymmetric-kernel spatial offset before combining.</w:t>
       </w:r>
     </w:p>
     <w:p>
@@ -265,14 +241,14 @@
           <w:b/>
           <w:sz w:val="22"/>
         </w:rPr>
-        <w:t xml:space="preserve">Step 6 — Combine, invert, equalize, unsharp (Result of S01). </w:t>
+        <w:t xml:space="preserve">Step 6 — Add, invert, equalize, unsharp (Result of S01). </w:t>
       </w:r>
       <w:r>
         <w:rPr>
           <w:rFonts w:ascii="Times New Roman" w:hAnsi="Times New Roman"/>
           <w:sz w:val="22"/>
         </w:rPr>
-        <w:t>Add S01 and S02 (Image Calculator), Invert, Enhance Contrast (Equalize histogram, saturated pixels = 0.00%), then Unsharp Mask (radius/σ = 10, weight = 0.60). Purpose: merge complementary gradients, present text as dark-on-light, stretch dynamic range, and sharpen edges.</w:t>
+        <w:t>Image Calculator Add; Invert; Enhance Contrast (Equalize, saturated 0.00%); Unsharp Mask (σ=10, weight=0.60). Merges gradients, dark-on-light contrast, sharpening.</w:t>
       </w:r>
     </w:p>
     <w:p>
@@ -289,7 +265,7 @@
           <w:rFonts w:ascii="Times New Roman" w:hAnsi="Times New Roman"/>
           <w:sz w:val="22"/>
         </w:rPr>
-        <w:t>Duplicate as Result of S02 and binarize with bottom = top = 0 (as specified). Purpose: isolate candidate stroke pixels.</w:t>
+        <w:t>Bottom = top = 0 (as assigned). Binarizes candidate strokes.</w:t>
       </w:r>
     </w:p>
     <w:p>
@@ -306,7 +282,7 @@
           <w:rFonts w:ascii="Times New Roman" w:hAnsi="Times New Roman"/>
           <w:sz w:val="22"/>
         </w:rPr>
-        <w:t>Translate S03 1 px right and OR with Result of S02. Purpose: bridge small horizontal gaps inside characters.</w:t>
+        <w:t>Translate + OR. Bridges small horizontal gaps in characters.</w:t>
       </w:r>
     </w:p>
     <w:p>
@@ -323,7 +299,7 @@
           <w:rFonts w:ascii="Times New Roman" w:hAnsi="Times New Roman"/>
           <w:sz w:val="22"/>
         </w:rPr>
-        <w:t>Translate S04 1 px down and AND with Result of S03. Purpose: trim spurious vertical thickness and noise.</w:t>
+        <w:t>Translate down + AND. Trims spurious vertical thickness/noise.</w:t>
       </w:r>
     </w:p>
     <w:p>
@@ -340,7 +316,7 @@
           <w:rFonts w:ascii="Times New Roman" w:hAnsi="Times New Roman"/>
           <w:sz w:val="22"/>
         </w:rPr>
-        <w:t>Median filter, radius 1.0, on Result of S04. Purpose: remove salt-and-pepper binary noise while preserving major edges better than linear averaging.</w:t>
+        <w:t>Median radius 1.0. Removes salt-and-pepper binary noise while preserving major edges.</w:t>
       </w:r>
     </w:p>
     <w:p>
@@ -350,14 +326,14 @@
           <w:b/>
           <w:sz w:val="22"/>
         </w:rPr>
-        <w:t xml:space="preserve">Step 11 — Bandpass filter (S05). </w:t>
+        <w:t xml:space="preserve">Step 11 — Bandpass (S05). </w:t>
       </w:r>
       <w:r>
         <w:rPr>
           <w:rFonts w:ascii="Times New Roman" w:hAnsi="Times New Roman"/>
           <w:sz w:val="22"/>
         </w:rPr>
-        <w:t>FFT Bandpass Filter with large structures = 40 px and small structures = 10 px. Purpose: attenuate broad illumination/relief trends and fine speckles while retaining mid-scale letter features.</w:t>
+        <w:t>FFT Bandpass: large=40 px, small=10 px (defaults). Removes broad shading and fine speckles; keeps mid-scale letters.</w:t>
       </w:r>
     </w:p>
     <w:p>
@@ -374,7 +350,7 @@
           <w:rFonts w:ascii="Times New Roman" w:hAnsi="Times New Roman"/>
           <w:sz w:val="22"/>
         </w:rPr>
-        <w:t>Unsharp Mask (10, 0.60) and equalize; record the Log-scale histogram of S06. Purpose: restore edge contrast after spectral filtering.</w:t>
+        <w:t>Unsharp (10, 0.60) + equalize; Log histogram of S06. Restores edge contrast after FFT filtering.</w:t>
       </w:r>
     </w:p>
     <w:p>
@@ -384,14 +360,14 @@
           <w:b/>
           <w:sz w:val="22"/>
         </w:rPr>
-        <w:t xml:space="preserve">Step 13 — Histogram-guided threshold (S07). </w:t>
+        <w:t xml:space="preserve">Step 13 — Histogram threshold (S07). </w:t>
       </w:r>
       <w:r>
         <w:rPr>
           <w:rFonts w:ascii="Times New Roman" w:hAnsi="Times New Roman"/>
           <w:sz w:val="22"/>
         </w:rPr>
-        <w:t>Binarize S07 using the darkest intensity and the darkest gap in the S06 histogram. Purpose: produce a clean binary mask for skeletonization.</w:t>
+        <w:t>Threshold using darkest intensity and darkest gap in S06 histogram.</w:t>
       </w:r>
     </w:p>
     <w:p>
@@ -408,7 +384,7 @@
           <w:rFonts w:ascii="Times New Roman" w:hAnsi="Times New Roman"/>
           <w:sz w:val="22"/>
         </w:rPr>
-        <w:t>Process → Binary → Skeletonize. Purpose: reduce strokes to one-pixel centerlines suitable for Hough voting.</w:t>
+        <w:t>Reduce binary regions to 1-pixel centerlines for Hough voting.</w:t>
       </w:r>
     </w:p>
     <w:p>
@@ -425,7 +401,7 @@
           <w:rFonts w:ascii="Times New Roman" w:hAnsi="Times New Roman"/>
           <w:sz w:val="22"/>
         </w:rPr>
-        <w:t>Apply Hough_Transform.java to S08, producing Hough of S08. Purpose: map points to (ρ, θ) curves; intersections vote for collinear text rows.</w:t>
+        <w:t>Hough_Transform.java on S08 → Hough of S08. Points vote as sinusoids in (ρ,θ); intersections mark lines.</w:t>
       </w:r>
     </w:p>
     <w:p>
@@ -435,14 +411,14 @@
           <w:b/>
           <w:sz w:val="22"/>
         </w:rPr>
-        <w:t xml:space="preserve">Step 16 — Centroid extraction. </w:t>
+        <w:t xml:space="preserve">Step 16 — Centroids. </w:t>
       </w:r>
       <w:r>
         <w:rPr>
           <w:rFonts w:ascii="Times New Roman" w:hAnsi="Times New Roman"/>
           <w:sz w:val="22"/>
         </w:rPr>
-        <w:t>Locate y-coordinates of centroids of prominent dark regions in Hough of S08 near the vertical middle axis. Purpose: estimate vertical positions of text rows.</w:t>
+        <w:t>y-coordinates of centroids of prominent dark regions near the vertical middle axis of Hough of S08 → text-row positions.</w:t>
       </w:r>
     </w:p>
     <w:p>
@@ -450,55 +426,31 @@
         <w:pStyle w:val="Heading1"/>
       </w:pPr>
       <w:r>
-        <w:t>3. Task 2 — Importance of Step 2 (Mean Filter)</w:t>
+        <w:t>3. Full default pipeline example (Image 1)</w:t>
       </w:r>
     </w:p>
     <w:p>
-      <w:pPr>
-        <w:spacing w:after="120"/>
-      </w:pPr>
       <w:r>
         <w:rPr>
           <w:rFonts w:ascii="Times New Roman" w:hAnsi="Times New Roman"/>
           <w:sz w:val="22"/>
         </w:rPr>
-        <w:t>Requirement: run the pipeline twice on the same photograph (with / without Step 2), then identify one image where including the Mean filter improves performance and another where omitting it is better.</w:t>
-      </w:r>
-    </w:p>
-    <w:p>
-      <w:pPr>
-        <w:spacing w:after="120"/>
-      </w:pPr>
-      <w:r>
-        <w:rPr>
-          <w:rFonts w:ascii="Times New Roman" w:hAnsi="Times New Roman"/>
-          <w:sz w:val="22"/>
-        </w:rPr>
-        <w:t>Submitted comparison outputs: s08-with2.jpg / s08-without2.jpg and the corresponding Hough accumulators.</w:t>
-      </w:r>
-    </w:p>
-    <w:p>
-      <w:pPr>
-        <w:pStyle w:val="Heading2"/>
-      </w:pPr>
-      <w:r>
-        <w:t>3.1 Experimental comparison (S08 and Hough)</w:t>
+        <w:t>Image 1 is a reddish khachkar processed with the full default pipeline (no step omitted; Bandpass at 40/10). Selected stages:</w:t>
       </w:r>
     </w:p>
     <w:tbl>
       <w:tblPr>
         <w:tblW w:type="auto" w:w="0"/>
-        <w:tblLayout w:type="autofit"/>
         <w:tblLook w:firstColumn="1" w:firstRow="1" w:lastColumn="0" w:lastRow="0" w:noHBand="0" w:noVBand="1" w:val="04A0"/>
       </w:tblPr>
       <w:tblGrid>
-        <w:gridCol w:w="4873"/>
-        <w:gridCol w:w="4873"/>
+        <w:gridCol w:w="4986"/>
+        <w:gridCol w:w="4986"/>
       </w:tblGrid>
       <w:tr>
         <w:tc>
           <w:tcPr>
-            <w:tcW w:type="dxa" w:w="4873"/>
+            <w:tcW w:type="dxa" w:w="4986"/>
           </w:tcPr>
           <w:p>
             <w:pPr>
@@ -507,7 +459,7 @@
             <w:r>
               <w:drawing>
                 <wp:inline xmlns:a="http://schemas.openxmlformats.org/drawingml/2006/main" xmlns:pic="http://schemas.openxmlformats.org/drawingml/2006/picture">
-                  <wp:extent cx="2331720" cy="3509239"/>
+                  <wp:extent cx="2240280" cy="4982610"/>
                   <wp:docPr id="1" name="Picture 1"/>
                   <wp:cNvGraphicFramePr>
                     <a:graphicFrameLocks noChangeAspect="1"/>
@@ -516,7 +468,7 @@
                     <a:graphicData uri="http://schemas.openxmlformats.org/drawingml/2006/picture">
                       <pic:pic>
                         <pic:nvPicPr>
-                          <pic:cNvPr id="0" name="s08-with2.jpg"/>
+                          <pic:cNvPr id="0" name="orig.jpg"/>
                           <pic:cNvPicPr/>
                         </pic:nvPicPr>
                         <pic:blipFill>
@@ -528,7 +480,7 @@
                         <pic:spPr>
                           <a:xfrm>
                             <a:off x="0" y="0"/>
-                            <a:ext cx="2331720" cy="3509239"/>
+                            <a:ext cx="2240280" cy="4982610"/>
                           </a:xfrm>
                           <a:prstGeom prst="rect"/>
                         </pic:spPr>
@@ -542,7 +494,7 @@
         </w:tc>
         <w:tc>
           <w:tcPr>
-            <w:tcW w:type="dxa" w:w="4873"/>
+            <w:tcW w:type="dxa" w:w="4986"/>
           </w:tcPr>
           <w:p>
             <w:pPr>
@@ -551,7 +503,7 @@
             <w:r>
               <w:drawing>
                 <wp:inline xmlns:a="http://schemas.openxmlformats.org/drawingml/2006/main" xmlns:pic="http://schemas.openxmlformats.org/drawingml/2006/picture">
-                  <wp:extent cx="2331720" cy="3509239"/>
+                  <wp:extent cx="2240280" cy="4984623"/>
                   <wp:docPr id="2" name="Picture 2"/>
                   <wp:cNvGraphicFramePr>
                     <a:graphicFrameLocks noChangeAspect="1"/>
@@ -560,7 +512,7 @@
                     <a:graphicData uri="http://schemas.openxmlformats.org/drawingml/2006/picture">
                       <pic:pic>
                         <pic:nvPicPr>
-                          <pic:cNvPr id="0" name="s08-without2.jpg"/>
+                          <pic:cNvPr id="0" name="s00.jpg"/>
                           <pic:cNvPicPr/>
                         </pic:nvPicPr>
                         <pic:blipFill>
@@ -572,7 +524,7 @@
                         <pic:spPr>
                           <a:xfrm>
                             <a:off x="0" y="0"/>
-                            <a:ext cx="2331720" cy="3509239"/>
+                            <a:ext cx="2240280" cy="4984623"/>
                           </a:xfrm>
                           <a:prstGeom prst="rect"/>
                         </pic:spPr>
@@ -588,7 +540,7 @@
       <w:tr>
         <w:tc>
           <w:tcPr>
-            <w:tcW w:type="dxa" w:w="4873"/>
+            <w:tcW w:type="dxa" w:w="4986"/>
           </w:tcPr>
           <w:p>
             <w:pPr>
@@ -600,13 +552,13 @@
                 <w:i/>
                 <w:sz w:val="16"/>
               </w:rPr>
-              <w:t>Figure 1. S08 WITH Step 2 (Mean included). Denser skeleton; more residual short branches.</w:t>
+              <w:t>Figure 1. Original photograph (Image 1).</w:t>
             </w:r>
           </w:p>
         </w:tc>
         <w:tc>
           <w:tcPr>
-            <w:tcW w:type="dxa" w:w="4873"/>
+            <w:tcW w:type="dxa" w:w="4986"/>
           </w:tcPr>
           <w:p>
             <w:pPr>
@@ -618,7 +570,7 @@
                 <w:i/>
                 <w:sz w:val="16"/>
               </w:rPr>
-              <w:t>Figure 2. S08 WITHOUT Step 2. Sparser skeleton; fewer fragments but also fewer connecting strokes.</w:t>
+              <w:t>Figure 2. S00 — scaled width 400, 8-bit grayscale.</w:t>
             </w:r>
           </w:p>
         </w:tc>
@@ -628,17 +580,16 @@
     <w:tbl>
       <w:tblPr>
         <w:tblW w:type="auto" w:w="0"/>
-        <w:tblLayout w:type="autofit"/>
         <w:tblLook w:firstColumn="1" w:firstRow="1" w:lastColumn="0" w:lastRow="0" w:noHBand="0" w:noVBand="1" w:val="04A0"/>
       </w:tblPr>
       <w:tblGrid>
-        <w:gridCol w:w="4873"/>
-        <w:gridCol w:w="4873"/>
+        <w:gridCol w:w="4986"/>
+        <w:gridCol w:w="4986"/>
       </w:tblGrid>
       <w:tr>
         <w:tc>
           <w:tcPr>
-            <w:tcW w:type="dxa" w:w="4873"/>
+            <w:tcW w:type="dxa" w:w="4986"/>
           </w:tcPr>
           <w:p>
             <w:pPr>
@@ -647,7 +598,7 @@
             <w:r>
               <w:drawing>
                 <wp:inline xmlns:a="http://schemas.openxmlformats.org/drawingml/2006/main" xmlns:pic="http://schemas.openxmlformats.org/drawingml/2006/picture">
-                  <wp:extent cx="2331720" cy="4208755"/>
+                  <wp:extent cx="2240280" cy="4984623"/>
                   <wp:docPr id="3" name="Picture 3"/>
                   <wp:cNvGraphicFramePr>
                     <a:graphicFrameLocks noChangeAspect="1"/>
@@ -656,7 +607,7 @@
                     <a:graphicData uri="http://schemas.openxmlformats.org/drawingml/2006/picture">
                       <pic:pic>
                         <pic:nvPicPr>
-                          <pic:cNvPr id="0" name="Hough of s08-with2.jpg"/>
+                          <pic:cNvPr id="0" name="Result of s01.jpg"/>
                           <pic:cNvPicPr/>
                         </pic:nvPicPr>
                         <pic:blipFill>
@@ -668,7 +619,7 @@
                         <pic:spPr>
                           <a:xfrm>
                             <a:off x="0" y="0"/>
-                            <a:ext cx="2331720" cy="4208755"/>
+                            <a:ext cx="2240280" cy="4984623"/>
                           </a:xfrm>
                           <a:prstGeom prst="rect"/>
                         </pic:spPr>
@@ -682,7 +633,7 @@
         </w:tc>
         <w:tc>
           <w:tcPr>
-            <w:tcW w:type="dxa" w:w="4873"/>
+            <w:tcW w:type="dxa" w:w="4986"/>
           </w:tcPr>
           <w:p>
             <w:pPr>
@@ -691,7 +642,7 @@
             <w:r>
               <w:drawing>
                 <wp:inline xmlns:a="http://schemas.openxmlformats.org/drawingml/2006/main" xmlns:pic="http://schemas.openxmlformats.org/drawingml/2006/picture">
-                  <wp:extent cx="2331720" cy="4208755"/>
+                  <wp:extent cx="2240280" cy="4984623"/>
                   <wp:docPr id="4" name="Picture 4"/>
                   <wp:cNvGraphicFramePr>
                     <a:graphicFrameLocks noChangeAspect="1"/>
@@ -700,7 +651,7 @@
                     <a:graphicData uri="http://schemas.openxmlformats.org/drawingml/2006/picture">
                       <pic:pic>
                         <pic:nvPicPr>
-                          <pic:cNvPr id="0" name="Hough of s08-without-step2.jpg"/>
+                          <pic:cNvPr id="0" name="Result of s02.jpg"/>
                           <pic:cNvPicPr/>
                         </pic:nvPicPr>
                         <pic:blipFill>
@@ -712,7 +663,7 @@
                         <pic:spPr>
                           <a:xfrm>
                             <a:off x="0" y="0"/>
-                            <a:ext cx="2331720" cy="4208755"/>
+                            <a:ext cx="2240280" cy="4984623"/>
                           </a:xfrm>
                           <a:prstGeom prst="rect"/>
                         </pic:spPr>
@@ -728,7 +679,7 @@
       <w:tr>
         <w:tc>
           <w:tcPr>
-            <w:tcW w:type="dxa" w:w="4873"/>
+            <w:tcW w:type="dxa" w:w="4986"/>
           </w:tcPr>
           <w:p>
             <w:pPr>
@@ -740,13 +691,13 @@
                 <w:i/>
                 <w:sz w:val="16"/>
               </w:rPr>
-              <w:t>Figure 3. Hough of S08 WITH Step 2. Denser sinusoidal voting.</w:t>
+              <w:t>Figure 3. Result of S01 after combine / invert / equalize / unsharp (Step 6).</w:t>
             </w:r>
           </w:p>
         </w:tc>
         <w:tc>
           <w:tcPr>
-            <w:tcW w:type="dxa" w:w="4873"/>
+            <w:tcW w:type="dxa" w:w="4986"/>
           </w:tcPr>
           <w:p>
             <w:pPr>
@@ -758,111 +709,26 @@
                 <w:i/>
                 <w:sz w:val="16"/>
               </w:rPr>
-              <w:t>Figure 4. Hough of S08 WITHOUT Step 2. Related but less densely filled accumulator.</w:t>
+              <w:t>Figure 4. Result of S02 — binary threshold (Step 7).</w:t>
             </w:r>
           </w:p>
         </w:tc>
       </w:tr>
     </w:tbl>
     <w:p/>
-    <w:p>
-      <w:pPr>
-        <w:pStyle w:val="Heading2"/>
-      </w:pPr>
-      <w:r>
-        <w:t>3.2 Interpretation</w:t>
-      </w:r>
-    </w:p>
-    <w:p>
-      <w:pPr>
-        <w:spacing w:after="120"/>
-      </w:pPr>
-      <w:r>
-        <w:rPr>
-          <w:rFonts w:ascii="Times New Roman" w:hAnsi="Times New Roman"/>
-          <w:sz w:val="22"/>
-        </w:rPr>
-        <w:t>On the submitted pair, including the Mean filter yields a substantially denser S08 (roughly 2.4× more foreground pixels than the without-Step-2 result). Visually, WITH Step 2 preserves more structural centerlines, while WITHOUT Step 2 looks cleaner but more incomplete.</w:t>
-      </w:r>
-    </w:p>
-    <w:p>
-      <w:pPr>
-        <w:spacing w:after="120"/>
-      </w:pPr>
-      <w:r>
-        <w:rPr>
-          <w:rFonts w:ascii="Times New Roman" w:hAnsi="Times New Roman"/>
-          <w:sz w:val="22"/>
-        </w:rPr>
-        <w:t>When inclusion helps: weathered, coarse stone with strong micro-texture. Mild Mean smoothing (r = 1) reduces false high-frequency edges before the directional convolutions, so true vertical strokes survive thresholding and morphology more reliably. The denser WITH skeleton is consistent with this case.</w:t>
-      </w:r>
-    </w:p>
-    <w:p>
-      <w:pPr>
-        <w:spacing w:after="120"/>
-      </w:pPr>
-      <w:r>
-        <w:rPr>
-          <w:rFonts w:ascii="Times New Roman" w:hAnsi="Times New Roman"/>
-          <w:sz w:val="22"/>
-        </w:rPr>
-        <w:t>When omission helps: already clean, high-contrast engravings or synthetic graphics. Mean smoothing can erase thin stroke detail and merge nearby features. The cleaner WITHOUT skeleton shows that omitting Step 2 can reduce clutter when grain noise is not the main problem.</w:t>
-      </w:r>
-    </w:p>
-    <w:p>
-      <w:pPr>
-        <w:spacing w:after="120"/>
-      </w:pPr>
-      <w:r>
-        <w:rPr>
-          <w:rFonts w:ascii="Times New Roman" w:hAnsi="Times New Roman"/>
-          <w:sz w:val="22"/>
-        </w:rPr>
-        <w:t>Action for full Task 2 credit: insert a second source photograph with its own same-image WITH/WITHOUT pair that supports the opposite conclusion from your first pair. Label them clearly as Image A (Mean helps) and Image B (omitting Mean helps).</w:t>
-      </w:r>
-    </w:p>
-    <w:p>
-      <w:pPr>
-        <w:pStyle w:val="Heading1"/>
-      </w:pPr>
-      <w:r>
-        <w:t>4. Task 3 — Importance of Step 5 (Translation)</w:t>
-      </w:r>
-    </w:p>
-    <w:p>
-      <w:pPr>
-        <w:spacing w:after="120"/>
-      </w:pPr>
-      <w:r>
-        <w:rPr>
-          <w:rFonts w:ascii="Times New Roman" w:hAnsi="Times New Roman"/>
-          <w:sz w:val="22"/>
-        </w:rPr>
-        <w:t>Step 5 translates S01 by +1 pixel in x and S02 by −1 pixel in x before combination, correcting the phase offset of the asymmetric kernels from Steps 3–4.</w:t>
-      </w:r>
-    </w:p>
-    <w:p>
-      <w:pPr>
-        <w:pStyle w:val="Heading2"/>
-      </w:pPr>
-      <w:r>
-        <w:t>4.1 Experimental comparison</w:t>
-      </w:r>
-    </w:p>
     <w:tbl>
       <w:tblPr>
         <w:tblW w:type="auto" w:w="0"/>
-        <w:tblLayout w:type="autofit"/>
         <w:tblLook w:firstColumn="1" w:firstRow="1" w:lastColumn="0" w:lastRow="0" w:noHBand="0" w:noVBand="1" w:val="04A0"/>
       </w:tblPr>
       <w:tblGrid>
-        <w:gridCol w:w="4873"/>
-        <w:gridCol w:w="4873"/>
+        <w:gridCol w:w="4986"/>
+        <w:gridCol w:w="4986"/>
       </w:tblGrid>
       <w:tr>
         <w:tc>
           <w:tcPr>
-            <w:tcW w:type="dxa" w:w="4873"/>
+            <w:tcW w:type="dxa" w:w="4986"/>
           </w:tcPr>
           <w:p>
             <w:pPr>
@@ -871,7 +737,7 @@
             <w:r>
               <w:drawing>
                 <wp:inline xmlns:a="http://schemas.openxmlformats.org/drawingml/2006/main" xmlns:pic="http://schemas.openxmlformats.org/drawingml/2006/picture">
-                  <wp:extent cx="2331720" cy="3509239"/>
+                  <wp:extent cx="2240280" cy="4984623"/>
                   <wp:docPr id="5" name="Picture 5"/>
                   <wp:cNvGraphicFramePr>
                     <a:graphicFrameLocks noChangeAspect="1"/>
@@ -880,7 +746,7 @@
                     <a:graphicData uri="http://schemas.openxmlformats.org/drawingml/2006/picture">
                       <pic:pic>
                         <pic:nvPicPr>
-                          <pic:cNvPr id="0" name="s08-withstep5.jpg"/>
+                          <pic:cNvPr id="0" name="s06.jpg"/>
                           <pic:cNvPicPr/>
                         </pic:nvPicPr>
                         <pic:blipFill>
@@ -892,7 +758,7 @@
                         <pic:spPr>
                           <a:xfrm>
                             <a:off x="0" y="0"/>
-                            <a:ext cx="2331720" cy="3509239"/>
+                            <a:ext cx="2240280" cy="4984623"/>
                           </a:xfrm>
                           <a:prstGeom prst="rect"/>
                         </pic:spPr>
@@ -906,7 +772,7 @@
         </w:tc>
         <w:tc>
           <w:tcPr>
-            <w:tcW w:type="dxa" w:w="4873"/>
+            <w:tcW w:type="dxa" w:w="4986"/>
           </w:tcPr>
           <w:p>
             <w:pPr>
@@ -915,7 +781,7 @@
             <w:r>
               <w:drawing>
                 <wp:inline xmlns:a="http://schemas.openxmlformats.org/drawingml/2006/main" xmlns:pic="http://schemas.openxmlformats.org/drawingml/2006/picture">
-                  <wp:extent cx="2331720" cy="3509239"/>
+                  <wp:extent cx="2240280" cy="2315641"/>
                   <wp:docPr id="6" name="Picture 6"/>
                   <wp:cNvGraphicFramePr>
                     <a:graphicFrameLocks noChangeAspect="1"/>
@@ -924,7 +790,7 @@
                     <a:graphicData uri="http://schemas.openxmlformats.org/drawingml/2006/picture">
                       <pic:pic>
                         <pic:nvPicPr>
-                          <pic:cNvPr id="0" name="s08-wothout5.jpg"/>
+                          <pic:cNvPr id="0" name="s06-log-histogram.jpg"/>
                           <pic:cNvPicPr/>
                         </pic:nvPicPr>
                         <pic:blipFill>
@@ -936,7 +802,7 @@
                         <pic:spPr>
                           <a:xfrm>
                             <a:off x="0" y="0"/>
-                            <a:ext cx="2331720" cy="3509239"/>
+                            <a:ext cx="2240280" cy="2315641"/>
                           </a:xfrm>
                           <a:prstGeom prst="rect"/>
                         </pic:spPr>
@@ -952,7 +818,7 @@
       <w:tr>
         <w:tc>
           <w:tcPr>
-            <w:tcW w:type="dxa" w:w="4873"/>
+            <w:tcW w:type="dxa" w:w="4986"/>
           </w:tcPr>
           <w:p>
             <w:pPr>
@@ -964,13 +830,13 @@
                 <w:i/>
                 <w:sz w:val="16"/>
               </w:rPr>
-              <w:t>Figure 5. S08 WITH Step 5. Dense, coherent skeletal structure.</w:t>
+              <w:t>Figure 5. S06 after Bandpass + sharpen/equalize.</w:t>
             </w:r>
           </w:p>
         </w:tc>
         <w:tc>
           <w:tcPr>
-            <w:tcW w:type="dxa" w:w="4873"/>
+            <w:tcW w:type="dxa" w:w="4986"/>
           </w:tcPr>
           <w:p>
             <w:pPr>
@@ -982,7 +848,7 @@
                 <w:i/>
                 <w:sz w:val="16"/>
               </w:rPr>
-              <w:t>Figure 6. S08 WITHOUT Step 5 (filename: wothout5). Much sparser / fragmented centerlines.</w:t>
+              <w:t>Figure 6. Log-scale histogram of S06 (assignment deliverable).</w:t>
             </w:r>
           </w:p>
         </w:tc>
@@ -992,17 +858,16 @@
     <w:tbl>
       <w:tblPr>
         <w:tblW w:type="auto" w:w="0"/>
-        <w:tblLayout w:type="autofit"/>
         <w:tblLook w:firstColumn="1" w:firstRow="1" w:lastColumn="0" w:lastRow="0" w:noHBand="0" w:noVBand="1" w:val="04A0"/>
       </w:tblPr>
       <w:tblGrid>
-        <w:gridCol w:w="4873"/>
-        <w:gridCol w:w="4873"/>
+        <w:gridCol w:w="4986"/>
+        <w:gridCol w:w="4986"/>
       </w:tblGrid>
       <w:tr>
         <w:tc>
           <w:tcPr>
-            <w:tcW w:type="dxa" w:w="4873"/>
+            <w:tcW w:type="dxa" w:w="4986"/>
           </w:tcPr>
           <w:p>
             <w:pPr>
@@ -1011,7 +876,7 @@
             <w:r>
               <w:drawing>
                 <wp:inline xmlns:a="http://schemas.openxmlformats.org/drawingml/2006/main" xmlns:pic="http://schemas.openxmlformats.org/drawingml/2006/picture">
-                  <wp:extent cx="2331720" cy="4208755"/>
+                  <wp:extent cx="2240280" cy="4984623"/>
                   <wp:docPr id="7" name="Picture 7"/>
                   <wp:cNvGraphicFramePr>
                     <a:graphicFrameLocks noChangeAspect="1"/>
@@ -1020,7 +885,7 @@
                     <a:graphicData uri="http://schemas.openxmlformats.org/drawingml/2006/picture">
                       <pic:pic>
                         <pic:nvPicPr>
-                          <pic:cNvPr id="0" name="Hough of s08-withstep5.jpg"/>
+                          <pic:cNvPr id="0" name="s08.jpg"/>
                           <pic:cNvPicPr/>
                         </pic:nvPicPr>
                         <pic:blipFill>
@@ -1032,7 +897,7 @@
                         <pic:spPr>
                           <a:xfrm>
                             <a:off x="0" y="0"/>
-                            <a:ext cx="2331720" cy="4208755"/>
+                            <a:ext cx="2240280" cy="4984623"/>
                           </a:xfrm>
                           <a:prstGeom prst="rect"/>
                         </pic:spPr>
@@ -1046,7 +911,7 @@
         </w:tc>
         <w:tc>
           <w:tcPr>
-            <w:tcW w:type="dxa" w:w="4873"/>
+            <w:tcW w:type="dxa" w:w="4986"/>
           </w:tcPr>
           <w:p>
             <w:pPr>
@@ -1055,7 +920,7 @@
             <w:r>
               <w:drawing>
                 <wp:inline xmlns:a="http://schemas.openxmlformats.org/drawingml/2006/main" xmlns:pic="http://schemas.openxmlformats.org/drawingml/2006/picture">
-                  <wp:extent cx="2331720" cy="4208755"/>
+                  <wp:extent cx="2240280" cy="5460682"/>
                   <wp:docPr id="8" name="Picture 8"/>
                   <wp:cNvGraphicFramePr>
                     <a:graphicFrameLocks noChangeAspect="1"/>
@@ -1064,7 +929,7 @@
                     <a:graphicData uri="http://schemas.openxmlformats.org/drawingml/2006/picture">
                       <pic:pic>
                         <pic:nvPicPr>
-                          <pic:cNvPr id="0" name="Hough of s08-without5.jpg"/>
+                          <pic:cNvPr id="0" name="Hough of s08.jpg"/>
                           <pic:cNvPicPr/>
                         </pic:nvPicPr>
                         <pic:blipFill>
@@ -1076,7 +941,7 @@
                         <pic:spPr>
                           <a:xfrm>
                             <a:off x="0" y="0"/>
-                            <a:ext cx="2331720" cy="4208755"/>
+                            <a:ext cx="2240280" cy="5460682"/>
                           </a:xfrm>
                           <a:prstGeom prst="rect"/>
                         </pic:spPr>
@@ -1092,7 +957,7 @@
       <w:tr>
         <w:tc>
           <w:tcPr>
-            <w:tcW w:type="dxa" w:w="4873"/>
+            <w:tcW w:type="dxa" w:w="4986"/>
           </w:tcPr>
           <w:p>
             <w:pPr>
@@ -1104,13 +969,13 @@
                 <w:i/>
                 <w:sz w:val="16"/>
               </w:rPr>
-              <w:t>Figure 7. Hough WITH Step 5 — stronger, more organized accumulator.</w:t>
+              <w:t>Figure 7. S08 — skeletonized centerlines (Step 14).</w:t>
             </w:r>
           </w:p>
         </w:tc>
         <w:tc>
           <w:tcPr>
-            <w:tcW w:type="dxa" w:w="4873"/>
+            <w:tcW w:type="dxa" w:w="4986"/>
           </w:tcPr>
           <w:p>
             <w:pPr>
@@ -1122,7 +987,7 @@
                 <w:i/>
                 <w:sz w:val="16"/>
               </w:rPr>
-              <w:t>Figure 8. Hough WITHOUT Step 5 — weaker / less structured voting.</w:t>
+              <w:t>Figure 8. Hough of S08 (Step 15).</w:t>
             </w:r>
           </w:p>
         </w:tc>
@@ -1131,78 +996,95 @@
     <w:p/>
     <w:p>
       <w:pPr>
-        <w:pStyle w:val="Heading2"/>
+        <w:pStyle w:val="Heading1"/>
       </w:pPr>
       <w:r>
-        <w:t>4.2 Conclusion</w:t>
+        <w:t>4. Task 2 — Importance of Step 2 (Mean Filter)</w:t>
       </w:r>
     </w:p>
     <w:p>
-      <w:pPr>
-        <w:spacing w:after="120"/>
-      </w:pPr>
       <w:r>
         <w:rPr>
           <w:rFonts w:ascii="Times New Roman" w:hAnsi="Times New Roman"/>
           <w:sz w:val="22"/>
         </w:rPr>
-        <w:t>Without translation, opposite-polarity gradient maps are misaligned. After addition and later binarization, edges may cancel or double, producing broken strokes. In the submitted pair, including Step 5 yields a far denser S08 (about 2.7× more foreground pixels) and a stronger Hough accumulator. Step 5 is therefore critical for accurate edge localization on this experiment.</w:t>
+        <w:t>Assignment: run the algorithm twice on the same photograph (WITH / WITHOUT Step 2). Then find one image where inclusion helps and another where omission helps. Different photographs may be used for those two cases, but each case must itself be a same-photo pair.</w:t>
       </w:r>
     </w:p>
     <w:p>
-      <w:pPr>
-        <w:spacing w:after="120"/>
-      </w:pPr>
       <w:r>
         <w:rPr>
           <w:rFonts w:ascii="Times New Roman" w:hAnsi="Times New Roman"/>
           <w:sz w:val="22"/>
         </w:rPr>
-        <w:t>Confirm that the WITH and WITHOUT runs use the identical original photograph. If a second image shows that omitting translation is less harmful (e.g., very clean synthetic text), include that pair for a Task-2-style completeness.</w:t>
+        <w:t>Original used for this Task 2 comparison set:</w:t>
       </w:r>
     </w:p>
     <w:p>
       <w:pPr>
-        <w:pStyle w:val="Heading1"/>
+        <w:jc w:val="center"/>
       </w:pPr>
       <w:r>
-        <w:t>5. Task 4 — Importance of Step 10 (Median Filter)</w:t>
+        <w:drawing>
+          <wp:inline xmlns:a="http://schemas.openxmlformats.org/drawingml/2006/main" xmlns:pic="http://schemas.openxmlformats.org/drawingml/2006/picture">
+            <wp:extent cx="2194560" cy="3302849"/>
+            <wp:docPr id="9" name="Picture 9"/>
+            <wp:cNvGraphicFramePr>
+              <a:graphicFrameLocks noChangeAspect="1"/>
+            </wp:cNvGraphicFramePr>
+            <a:graphic>
+              <a:graphicData uri="http://schemas.openxmlformats.org/drawingml/2006/picture">
+                <pic:pic>
+                  <pic:nvPicPr>
+                    <pic:cNvPr id="0" name="orig-forstep2.jpg"/>
+                    <pic:cNvPicPr/>
+                  </pic:nvPicPr>
+                  <pic:blipFill>
+                    <a:blip r:embed="rId17"/>
+                    <a:stretch>
+                      <a:fillRect/>
+                    </a:stretch>
+                  </pic:blipFill>
+                  <pic:spPr>
+                    <a:xfrm>
+                      <a:off x="0" y="0"/>
+                      <a:ext cx="2194560" cy="3302849"/>
+                    </a:xfrm>
+                    <a:prstGeom prst="rect"/>
+                  </pic:spPr>
+                </pic:pic>
+              </a:graphicData>
+            </a:graphic>
+          </wp:inline>
+        </w:drawing>
       </w:r>
     </w:p>
     <w:p>
       <w:pPr>
-        <w:spacing w:after="120"/>
+        <w:jc w:val="center"/>
       </w:pPr>
       <w:r>
         <w:rPr>
           <w:rFonts w:ascii="Times New Roman" w:hAnsi="Times New Roman"/>
-          <w:sz w:val="22"/>
+          <w:i/>
+          <w:sz w:val="18"/>
         </w:rPr>
-        <w:t>Official Step 10 applies a Median filter (radius 1.0) to Result of S04. This is not the Bandpass step; Bandpass is Step 11. Median removes isolated salt-and-pepper pixels after morphology while preserving major edges better than a mean filter.</w:t>
-      </w:r>
-    </w:p>
-    <w:p>
-      <w:pPr>
-        <w:pStyle w:val="Heading2"/>
-      </w:pPr>
-      <w:r>
-        <w:t>5.1 Experimental comparison</w:t>
+        <w:t>Figure 9. Original photograph used for the Step 2 study (khachkar with dense side inscriptions).</w:t>
       </w:r>
     </w:p>
     <w:tbl>
       <w:tblPr>
         <w:tblW w:type="auto" w:w="0"/>
-        <w:tblLayout w:type="autofit"/>
         <w:tblLook w:firstColumn="1" w:firstRow="1" w:lastColumn="0" w:lastRow="0" w:noHBand="0" w:noVBand="1" w:val="04A0"/>
       </w:tblPr>
       <w:tblGrid>
-        <w:gridCol w:w="4873"/>
-        <w:gridCol w:w="4873"/>
+        <w:gridCol w:w="4986"/>
+        <w:gridCol w:w="4986"/>
       </w:tblGrid>
       <w:tr>
         <w:tc>
           <w:tcPr>
-            <w:tcW w:type="dxa" w:w="4873"/>
+            <w:tcW w:type="dxa" w:w="4986"/>
           </w:tcPr>
           <w:p>
             <w:pPr>
@@ -1211,8 +1093,8 @@
             <w:r>
               <w:drawing>
                 <wp:inline xmlns:a="http://schemas.openxmlformats.org/drawingml/2006/main" xmlns:pic="http://schemas.openxmlformats.org/drawingml/2006/picture">
-                  <wp:extent cx="2331720" cy="3509239"/>
-                  <wp:docPr id="9" name="Picture 9"/>
+                  <wp:extent cx="2240280" cy="3371621"/>
+                  <wp:docPr id="10" name="Picture 10"/>
                   <wp:cNvGraphicFramePr>
                     <a:graphicFrameLocks noChangeAspect="1"/>
                   </wp:cNvGraphicFramePr>
@@ -1220,11 +1102,11 @@
                     <a:graphicData uri="http://schemas.openxmlformats.org/drawingml/2006/picture">
                       <pic:pic>
                         <pic:nvPicPr>
-                          <pic:cNvPr id="0" name="s08-withstep10.jpg"/>
+                          <pic:cNvPr id="0" name="s08-with2.jpg"/>
                           <pic:cNvPicPr/>
                         </pic:nvPicPr>
                         <pic:blipFill>
-                          <a:blip r:embed="rId17"/>
+                          <a:blip r:embed="rId18"/>
                           <a:stretch>
                             <a:fillRect/>
                           </a:stretch>
@@ -1232,7 +1114,7 @@
                         <pic:spPr>
                           <a:xfrm>
                             <a:off x="0" y="0"/>
-                            <a:ext cx="2331720" cy="3509239"/>
+                            <a:ext cx="2240280" cy="3371621"/>
                           </a:xfrm>
                           <a:prstGeom prst="rect"/>
                         </pic:spPr>
@@ -1246,7 +1128,7 @@
         </w:tc>
         <w:tc>
           <w:tcPr>
-            <w:tcW w:type="dxa" w:w="4873"/>
+            <w:tcW w:type="dxa" w:w="4986"/>
           </w:tcPr>
           <w:p>
             <w:pPr>
@@ -1255,8 +1137,8 @@
             <w:r>
               <w:drawing>
                 <wp:inline xmlns:a="http://schemas.openxmlformats.org/drawingml/2006/main" xmlns:pic="http://schemas.openxmlformats.org/drawingml/2006/picture">
-                  <wp:extent cx="2331720" cy="3509239"/>
-                  <wp:docPr id="10" name="Picture 10"/>
+                  <wp:extent cx="2240280" cy="3371621"/>
+                  <wp:docPr id="11" name="Picture 11"/>
                   <wp:cNvGraphicFramePr>
                     <a:graphicFrameLocks noChangeAspect="1"/>
                   </wp:cNvGraphicFramePr>
@@ -1264,11 +1146,11 @@
                     <a:graphicData uri="http://schemas.openxmlformats.org/drawingml/2006/picture">
                       <pic:pic>
                         <pic:nvPicPr>
-                          <pic:cNvPr id="0" name="s08-withoutstep10.jpg"/>
+                          <pic:cNvPr id="0" name="s08-without2.jpg"/>
                           <pic:cNvPicPr/>
                         </pic:nvPicPr>
                         <pic:blipFill>
-                          <a:blip r:embed="rId18"/>
+                          <a:blip r:embed="rId19"/>
                           <a:stretch>
                             <a:fillRect/>
                           </a:stretch>
@@ -1276,7 +1158,7 @@
                         <pic:spPr>
                           <a:xfrm>
                             <a:off x="0" y="0"/>
-                            <a:ext cx="2331720" cy="3509239"/>
+                            <a:ext cx="2240280" cy="3371621"/>
                           </a:xfrm>
                           <a:prstGeom prst="rect"/>
                         </pic:spPr>
@@ -1292,7 +1174,7 @@
       <w:tr>
         <w:tc>
           <w:tcPr>
-            <w:tcW w:type="dxa" w:w="4873"/>
+            <w:tcW w:type="dxa" w:w="4986"/>
           </w:tcPr>
           <w:p>
             <w:pPr>
@@ -1304,13 +1186,13 @@
                 <w:i/>
                 <w:sz w:val="16"/>
               </w:rPr>
-              <w:t>Figure 9. S08 WITH Step 10 (Median included).</w:t>
+              <w:t>Figure 10. S08 WITH Step 2 (Mean). Denser skeleton; more short branches remain.</w:t>
             </w:r>
           </w:p>
         </w:tc>
         <w:tc>
           <w:tcPr>
-            <w:tcW w:type="dxa" w:w="4873"/>
+            <w:tcW w:type="dxa" w:w="4986"/>
           </w:tcPr>
           <w:p>
             <w:pPr>
@@ -1322,7 +1204,7 @@
                 <w:i/>
                 <w:sz w:val="16"/>
               </w:rPr>
-              <w:t>Figure 10. S08 WITHOUT Step 10. Primary layout remains essentially the same.</w:t>
+              <w:t>Figure 11. S08 WITHOUT Step 2. Sparser / cleaner but less complete centerlines.</w:t>
             </w:r>
           </w:p>
         </w:tc>
@@ -1332,17 +1214,16 @@
     <w:tbl>
       <w:tblPr>
         <w:tblW w:type="auto" w:w="0"/>
-        <w:tblLayout w:type="autofit"/>
         <w:tblLook w:firstColumn="1" w:firstRow="1" w:lastColumn="0" w:lastRow="0" w:noHBand="0" w:noVBand="1" w:val="04A0"/>
       </w:tblPr>
       <w:tblGrid>
-        <w:gridCol w:w="4873"/>
-        <w:gridCol w:w="4873"/>
+        <w:gridCol w:w="4986"/>
+        <w:gridCol w:w="4986"/>
       </w:tblGrid>
       <w:tr>
         <w:tc>
           <w:tcPr>
-            <w:tcW w:type="dxa" w:w="4873"/>
+            <w:tcW w:type="dxa" w:w="4986"/>
           </w:tcPr>
           <w:p>
             <w:pPr>
@@ -1351,8 +1232,8 @@
             <w:r>
               <w:drawing>
                 <wp:inline xmlns:a="http://schemas.openxmlformats.org/drawingml/2006/main" xmlns:pic="http://schemas.openxmlformats.org/drawingml/2006/picture">
-                  <wp:extent cx="2331720" cy="4208755"/>
-                  <wp:docPr id="11" name="Picture 11"/>
+                  <wp:extent cx="2240280" cy="4043705"/>
+                  <wp:docPr id="12" name="Picture 12"/>
                   <wp:cNvGraphicFramePr>
                     <a:graphicFrameLocks noChangeAspect="1"/>
                   </wp:cNvGraphicFramePr>
@@ -1360,11 +1241,11 @@
                     <a:graphicData uri="http://schemas.openxmlformats.org/drawingml/2006/picture">
                       <pic:pic>
                         <pic:nvPicPr>
-                          <pic:cNvPr id="0" name="Hough of s08-withstep10.jpg"/>
+                          <pic:cNvPr id="0" name="Hough of s08-with2.jpg"/>
                           <pic:cNvPicPr/>
                         </pic:nvPicPr>
                         <pic:blipFill>
-                          <a:blip r:embed="rId19"/>
+                          <a:blip r:embed="rId20"/>
                           <a:stretch>
                             <a:fillRect/>
                           </a:stretch>
@@ -1372,7 +1253,7 @@
                         <pic:spPr>
                           <a:xfrm>
                             <a:off x="0" y="0"/>
-                            <a:ext cx="2331720" cy="4208755"/>
+                            <a:ext cx="2240280" cy="4043705"/>
                           </a:xfrm>
                           <a:prstGeom prst="rect"/>
                         </pic:spPr>
@@ -1386,7 +1267,7 @@
         </w:tc>
         <w:tc>
           <w:tcPr>
-            <w:tcW w:type="dxa" w:w="4873"/>
+            <w:tcW w:type="dxa" w:w="4986"/>
           </w:tcPr>
           <w:p>
             <w:pPr>
@@ -1395,8 +1276,8 @@
             <w:r>
               <w:drawing>
                 <wp:inline xmlns:a="http://schemas.openxmlformats.org/drawingml/2006/main" xmlns:pic="http://schemas.openxmlformats.org/drawingml/2006/picture">
-                  <wp:extent cx="2331720" cy="4208755"/>
-                  <wp:docPr id="12" name="Picture 12"/>
+                  <wp:extent cx="2240280" cy="4043705"/>
+                  <wp:docPr id="13" name="Picture 13"/>
                   <wp:cNvGraphicFramePr>
                     <a:graphicFrameLocks noChangeAspect="1"/>
                   </wp:cNvGraphicFramePr>
@@ -1404,11 +1285,11 @@
                     <a:graphicData uri="http://schemas.openxmlformats.org/drawingml/2006/picture">
                       <pic:pic>
                         <pic:nvPicPr>
-                          <pic:cNvPr id="0" name="Hough of s08-withoutstep10.jpg"/>
+                          <pic:cNvPr id="0" name="Hough of s08-without-step2.jpg"/>
                           <pic:cNvPicPr/>
                         </pic:nvPicPr>
                         <pic:blipFill>
-                          <a:blip r:embed="rId20"/>
+                          <a:blip r:embed="rId21"/>
                           <a:stretch>
                             <a:fillRect/>
                           </a:stretch>
@@ -1416,7 +1297,7 @@
                         <pic:spPr>
                           <a:xfrm>
                             <a:off x="0" y="0"/>
-                            <a:ext cx="2331720" cy="4208755"/>
+                            <a:ext cx="2240280" cy="4043705"/>
                           </a:xfrm>
                           <a:prstGeom prst="rect"/>
                         </pic:spPr>
@@ -1432,7 +1313,7 @@
       <w:tr>
         <w:tc>
           <w:tcPr>
-            <w:tcW w:type="dxa" w:w="4873"/>
+            <w:tcW w:type="dxa" w:w="4986"/>
           </w:tcPr>
           <w:p>
             <w:pPr>
@@ -1444,13 +1325,13 @@
                 <w:i/>
                 <w:sz w:val="16"/>
               </w:rPr>
-              <w:t>Figure 11. Hough WITH Step 10.</w:t>
+              <w:t>Figure 12. Hough WITH Step 2 — denser voting patterns.</w:t>
             </w:r>
           </w:p>
         </w:tc>
         <w:tc>
           <w:tcPr>
-            <w:tcW w:type="dxa" w:w="4873"/>
+            <w:tcW w:type="dxa" w:w="4986"/>
           </w:tcPr>
           <w:p>
             <w:pPr>
@@ -1462,7 +1343,7 @@
                 <w:i/>
                 <w:sz w:val="16"/>
               </w:rPr>
-              <w:t>Figure 12. Hough WITHOUT Step 10 — highly similar accumulator structure.</w:t>
+              <w:t>Figure 13. Hough WITHOUT Step 2 — less densely filled accumulator.</w:t>
             </w:r>
           </w:p>
         </w:tc>
@@ -1470,23 +1351,55 @@
     </w:tbl>
     <w:p/>
     <w:p>
-      <w:pPr>
-        <w:pStyle w:val="Heading2"/>
-      </w:pPr>
-      <w:r>
-        <w:t>5.2 Conclusion</w:t>
-      </w:r>
-    </w:p>
-    <w:p>
-      <w:pPr>
-        <w:spacing w:after="120"/>
-      </w:pPr>
       <w:r>
         <w:rPr>
           <w:rFonts w:ascii="Times New Roman" w:hAnsi="Times New Roman"/>
           <w:sz w:val="22"/>
         </w:rPr>
-        <w:t>For the submitted pair, WITH and WITHOUT Median produce nearly identical S08 results (foreground counts differ only by about 2%) and very similar Hough patterns. Earlier morphology (Steps 8–9) and later Bandpass/thresholding already suppress much of the isolated noise that Median would remove. Practical impact of Step 10 is therefore minor on this image, although Median remains a cheap and theoretically justified binary cleanup before spectral filtering, especially when Result of S04 still contains salt-and-pepper spikes.</w:t>
+        <w:t>Observation: WITH Mean yields roughly 2.4× more S08 foreground pixels than WITHOUT on this pair. Including Step 2 preserves more structural strokes on weathered stone grain; omitting it reduces clutter but also loses connecting strokes.</w:t>
+      </w:r>
+    </w:p>
+    <w:p>
+      <w:r>
+        <w:rPr>
+          <w:rFonts w:ascii="Times New Roman" w:hAnsi="Times New Roman"/>
+          <w:b/>
+          <w:sz w:val="22"/>
+        </w:rPr>
+        <w:t xml:space="preserve">When inclusion helps: </w:t>
+      </w:r>
+      <w:r>
+        <w:rPr>
+          <w:rFonts w:ascii="Times New Roman" w:hAnsi="Times New Roman"/>
+          <w:sz w:val="22"/>
+        </w:rPr>
+        <w:t>highly weathered / coarse stone where micro-texture creates false edges — mild Mean (r=1) stabilizes later derivatives.</w:t>
+      </w:r>
+    </w:p>
+    <w:p>
+      <w:r>
+        <w:rPr>
+          <w:rFonts w:ascii="Times New Roman" w:hAnsi="Times New Roman"/>
+          <w:b/>
+          <w:sz w:val="22"/>
+        </w:rPr>
+        <w:t xml:space="preserve">When omission helps: </w:t>
+      </w:r>
+      <w:r>
+        <w:rPr>
+          <w:rFonts w:ascii="Times New Roman" w:hAnsi="Times New Roman"/>
+          <w:sz w:val="22"/>
+        </w:rPr>
+        <w:t>already clean high-contrast engravings — Mean can blur thin strokes; omitting it keeps sharper corners.</w:t>
+      </w:r>
+    </w:p>
+    <w:p>
+      <w:r>
+        <w:rPr>
+          <w:rFonts w:ascii="Times New Roman" w:hAnsi="Times New Roman"/>
+          <w:sz w:val="22"/>
+        </w:rPr>
+        <w:t>Note: if a second opposite-case monument pair is available, insert it here labeled Image B to fully match the “one better with / one better without” wording.</w:t>
       </w:r>
     </w:p>
     <w:p>
@@ -1494,31 +1407,1609 @@
         <w:pStyle w:val="Heading1"/>
       </w:pPr>
       <w:r>
-        <w:t>6. Task 5 — Bandpass Parameters (Step 11)</w:t>
+        <w:t>5. Task 3 — Importance of Step 5 (Translation)</w:t>
       </w:r>
     </w:p>
     <w:p>
-      <w:pPr>
-        <w:spacing w:after="120"/>
-      </w:pPr>
       <w:r>
         <w:rPr>
           <w:rFonts w:ascii="Times New Roman" w:hAnsi="Times New Roman"/>
           <w:sz w:val="22"/>
         </w:rPr>
-        <w:t>Step 11 uses Process → FFT → Bandpass Filter with defaults large structures = 40 pixels and small structures = 10 pixels. The large-structure setting controls how much broad illumination and large relief are suppressed. The small-structure setting controls removal of fine grain and speckles. The assignment emphasizes studying especially the small-structure size.</w:t>
+        <w:t>Step 5 translates S01 +1 px and S02 −1 px to align asymmetric kernel responses before addition. A different source photo was used for this task than for Task 2 (allowed).</w:t>
       </w:r>
     </w:p>
     <w:p>
       <w:pPr>
-        <w:spacing w:after="120"/>
+        <w:jc w:val="center"/>
       </w:pPr>
+      <w:r>
+        <w:drawing>
+          <wp:inline xmlns:a="http://schemas.openxmlformats.org/drawingml/2006/main" xmlns:pic="http://schemas.openxmlformats.org/drawingml/2006/picture">
+            <wp:extent cx="2011680" cy="3048374"/>
+            <wp:docPr id="14" name="Picture 14"/>
+            <wp:cNvGraphicFramePr>
+              <a:graphicFrameLocks noChangeAspect="1"/>
+            </wp:cNvGraphicFramePr>
+            <a:graphic>
+              <a:graphicData uri="http://schemas.openxmlformats.org/drawingml/2006/picture">
+                <pic:pic>
+                  <pic:nvPicPr>
+                    <pic:cNvPr id="0" name="orig-forstep5.jpg"/>
+                    <pic:cNvPicPr/>
+                  </pic:nvPicPr>
+                  <pic:blipFill>
+                    <a:blip r:embed="rId22"/>
+                    <a:stretch>
+                      <a:fillRect/>
+                    </a:stretch>
+                  </pic:blipFill>
+                  <pic:spPr>
+                    <a:xfrm>
+                      <a:off x="0" y="0"/>
+                      <a:ext cx="2011680" cy="3048374"/>
+                    </a:xfrm>
+                    <a:prstGeom prst="rect"/>
+                  </pic:spPr>
+                </pic:pic>
+              </a:graphicData>
+            </a:graphic>
+          </wp:inline>
+        </w:drawing>
+      </w:r>
+    </w:p>
+    <w:p>
+      <w:pPr>
+        <w:jc w:val="center"/>
+      </w:pPr>
+      <w:r>
+        <w:rPr>
+          <w:rFonts w:ascii="Times New Roman" w:hAnsi="Times New Roman"/>
+          <w:i/>
+          <w:sz w:val="18"/>
+        </w:rPr>
+        <w:t>Figure 14. Original photograph used for the Step 5 study.</w:t>
+      </w:r>
+    </w:p>
+    <w:tbl>
+      <w:tblPr>
+        <w:tblW w:type="auto" w:w="0"/>
+        <w:tblLook w:firstColumn="1" w:firstRow="1" w:lastColumn="0" w:lastRow="0" w:noHBand="0" w:noVBand="1" w:val="04A0"/>
+      </w:tblPr>
+      <w:tblGrid>
+        <w:gridCol w:w="4986"/>
+        <w:gridCol w:w="4986"/>
+      </w:tblGrid>
+      <w:tr>
+        <w:tc>
+          <w:tcPr>
+            <w:tcW w:type="dxa" w:w="4986"/>
+          </w:tcPr>
+          <w:p>
+            <w:pPr>
+              <w:jc w:val="center"/>
+            </w:pPr>
+            <w:r>
+              <w:drawing>
+                <wp:inline xmlns:a="http://schemas.openxmlformats.org/drawingml/2006/main" xmlns:pic="http://schemas.openxmlformats.org/drawingml/2006/picture">
+                  <wp:extent cx="2240280" cy="3371621"/>
+                  <wp:docPr id="15" name="Picture 15"/>
+                  <wp:cNvGraphicFramePr>
+                    <a:graphicFrameLocks noChangeAspect="1"/>
+                  </wp:cNvGraphicFramePr>
+                  <a:graphic>
+                    <a:graphicData uri="http://schemas.openxmlformats.org/drawingml/2006/picture">
+                      <pic:pic>
+                        <pic:nvPicPr>
+                          <pic:cNvPr id="0" name="s08-withstep5.jpg"/>
+                          <pic:cNvPicPr/>
+                        </pic:nvPicPr>
+                        <pic:blipFill>
+                          <a:blip r:embed="rId23"/>
+                          <a:stretch>
+                            <a:fillRect/>
+                          </a:stretch>
+                        </pic:blipFill>
+                        <pic:spPr>
+                          <a:xfrm>
+                            <a:off x="0" y="0"/>
+                            <a:ext cx="2240280" cy="3371621"/>
+                          </a:xfrm>
+                          <a:prstGeom prst="rect"/>
+                        </pic:spPr>
+                      </pic:pic>
+                    </a:graphicData>
+                  </a:graphic>
+                </wp:inline>
+              </w:drawing>
+            </w:r>
+          </w:p>
+        </w:tc>
+        <w:tc>
+          <w:tcPr>
+            <w:tcW w:type="dxa" w:w="4986"/>
+          </w:tcPr>
+          <w:p>
+            <w:pPr>
+              <w:jc w:val="center"/>
+            </w:pPr>
+            <w:r>
+              <w:drawing>
+                <wp:inline xmlns:a="http://schemas.openxmlformats.org/drawingml/2006/main" xmlns:pic="http://schemas.openxmlformats.org/drawingml/2006/picture">
+                  <wp:extent cx="2240280" cy="3371621"/>
+                  <wp:docPr id="16" name="Picture 16"/>
+                  <wp:cNvGraphicFramePr>
+                    <a:graphicFrameLocks noChangeAspect="1"/>
+                  </wp:cNvGraphicFramePr>
+                  <a:graphic>
+                    <a:graphicData uri="http://schemas.openxmlformats.org/drawingml/2006/picture">
+                      <pic:pic>
+                        <pic:nvPicPr>
+                          <pic:cNvPr id="0" name="s08-wothout5.jpg"/>
+                          <pic:cNvPicPr/>
+                        </pic:nvPicPr>
+                        <pic:blipFill>
+                          <a:blip r:embed="rId24"/>
+                          <a:stretch>
+                            <a:fillRect/>
+                          </a:stretch>
+                        </pic:blipFill>
+                        <pic:spPr>
+                          <a:xfrm>
+                            <a:off x="0" y="0"/>
+                            <a:ext cx="2240280" cy="3371621"/>
+                          </a:xfrm>
+                          <a:prstGeom prst="rect"/>
+                        </pic:spPr>
+                      </pic:pic>
+                    </a:graphicData>
+                  </a:graphic>
+                </wp:inline>
+              </w:drawing>
+            </w:r>
+          </w:p>
+        </w:tc>
+      </w:tr>
+      <w:tr>
+        <w:tc>
+          <w:tcPr>
+            <w:tcW w:type="dxa" w:w="4986"/>
+          </w:tcPr>
+          <w:p>
+            <w:pPr>
+              <w:jc w:val="center"/>
+            </w:pPr>
+            <w:r>
+              <w:rPr>
+                <w:rFonts w:ascii="Times New Roman" w:hAnsi="Times New Roman"/>
+                <w:i/>
+                <w:sz w:val="16"/>
+              </w:rPr>
+              <w:t>Figure 15. S08 WITH Step 5. Dense coherent skeletal structure.</w:t>
+            </w:r>
+          </w:p>
+        </w:tc>
+        <w:tc>
+          <w:tcPr>
+            <w:tcW w:type="dxa" w:w="4986"/>
+          </w:tcPr>
+          <w:p>
+            <w:pPr>
+              <w:jc w:val="center"/>
+            </w:pPr>
+            <w:r>
+              <w:rPr>
+                <w:rFonts w:ascii="Times New Roman" w:hAnsi="Times New Roman"/>
+                <w:i/>
+                <w:sz w:val="16"/>
+              </w:rPr>
+              <w:t>Figure 16. S08 WITHOUT Step 5. Much sparser / fragmented centerlines.</w:t>
+            </w:r>
+          </w:p>
+        </w:tc>
+      </w:tr>
+    </w:tbl>
+    <w:p/>
+    <w:tbl>
+      <w:tblPr>
+        <w:tblW w:type="auto" w:w="0"/>
+        <w:tblLook w:firstColumn="1" w:firstRow="1" w:lastColumn="0" w:lastRow="0" w:noHBand="0" w:noVBand="1" w:val="04A0"/>
+      </w:tblPr>
+      <w:tblGrid>
+        <w:gridCol w:w="4986"/>
+        <w:gridCol w:w="4986"/>
+      </w:tblGrid>
+      <w:tr>
+        <w:tc>
+          <w:tcPr>
+            <w:tcW w:type="dxa" w:w="4986"/>
+          </w:tcPr>
+          <w:p>
+            <w:pPr>
+              <w:jc w:val="center"/>
+            </w:pPr>
+            <w:r>
+              <w:drawing>
+                <wp:inline xmlns:a="http://schemas.openxmlformats.org/drawingml/2006/main" xmlns:pic="http://schemas.openxmlformats.org/drawingml/2006/picture">
+                  <wp:extent cx="2240280" cy="4043705"/>
+                  <wp:docPr id="17" name="Picture 17"/>
+                  <wp:cNvGraphicFramePr>
+                    <a:graphicFrameLocks noChangeAspect="1"/>
+                  </wp:cNvGraphicFramePr>
+                  <a:graphic>
+                    <a:graphicData uri="http://schemas.openxmlformats.org/drawingml/2006/picture">
+                      <pic:pic>
+                        <pic:nvPicPr>
+                          <pic:cNvPr id="0" name="Hough of s08-withstep5.jpg"/>
+                          <pic:cNvPicPr/>
+                        </pic:nvPicPr>
+                        <pic:blipFill>
+                          <a:blip r:embed="rId25"/>
+                          <a:stretch>
+                            <a:fillRect/>
+                          </a:stretch>
+                        </pic:blipFill>
+                        <pic:spPr>
+                          <a:xfrm>
+                            <a:off x="0" y="0"/>
+                            <a:ext cx="2240280" cy="4043705"/>
+                          </a:xfrm>
+                          <a:prstGeom prst="rect"/>
+                        </pic:spPr>
+                      </pic:pic>
+                    </a:graphicData>
+                  </a:graphic>
+                </wp:inline>
+              </w:drawing>
+            </w:r>
+          </w:p>
+        </w:tc>
+        <w:tc>
+          <w:tcPr>
+            <w:tcW w:type="dxa" w:w="4986"/>
+          </w:tcPr>
+          <w:p>
+            <w:pPr>
+              <w:jc w:val="center"/>
+            </w:pPr>
+            <w:r>
+              <w:drawing>
+                <wp:inline xmlns:a="http://schemas.openxmlformats.org/drawingml/2006/main" xmlns:pic="http://schemas.openxmlformats.org/drawingml/2006/picture">
+                  <wp:extent cx="2240280" cy="4043705"/>
+                  <wp:docPr id="18" name="Picture 18"/>
+                  <wp:cNvGraphicFramePr>
+                    <a:graphicFrameLocks noChangeAspect="1"/>
+                  </wp:cNvGraphicFramePr>
+                  <a:graphic>
+                    <a:graphicData uri="http://schemas.openxmlformats.org/drawingml/2006/picture">
+                      <pic:pic>
+                        <pic:nvPicPr>
+                          <pic:cNvPr id="0" name="Hough of s08-without5.jpg"/>
+                          <pic:cNvPicPr/>
+                        </pic:nvPicPr>
+                        <pic:blipFill>
+                          <a:blip r:embed="rId26"/>
+                          <a:stretch>
+                            <a:fillRect/>
+                          </a:stretch>
+                        </pic:blipFill>
+                        <pic:spPr>
+                          <a:xfrm>
+                            <a:off x="0" y="0"/>
+                            <a:ext cx="2240280" cy="4043705"/>
+                          </a:xfrm>
+                          <a:prstGeom prst="rect"/>
+                        </pic:spPr>
+                      </pic:pic>
+                    </a:graphicData>
+                  </a:graphic>
+                </wp:inline>
+              </w:drawing>
+            </w:r>
+          </w:p>
+        </w:tc>
+      </w:tr>
+      <w:tr>
+        <w:tc>
+          <w:tcPr>
+            <w:tcW w:type="dxa" w:w="4986"/>
+          </w:tcPr>
+          <w:p>
+            <w:pPr>
+              <w:jc w:val="center"/>
+            </w:pPr>
+            <w:r>
+              <w:rPr>
+                <w:rFonts w:ascii="Times New Roman" w:hAnsi="Times New Roman"/>
+                <w:i/>
+                <w:sz w:val="16"/>
+              </w:rPr>
+              <w:t>Figure 17. Hough WITH Step 5 — stronger organized accumulator.</w:t>
+            </w:r>
+          </w:p>
+        </w:tc>
+        <w:tc>
+          <w:tcPr>
+            <w:tcW w:type="dxa" w:w="4986"/>
+          </w:tcPr>
+          <w:p>
+            <w:pPr>
+              <w:jc w:val="center"/>
+            </w:pPr>
+            <w:r>
+              <w:rPr>
+                <w:rFonts w:ascii="Times New Roman" w:hAnsi="Times New Roman"/>
+                <w:i/>
+                <w:sz w:val="16"/>
+              </w:rPr>
+              <w:t>Figure 18. Hough WITHOUT Step 5 — weaker structure.</w:t>
+            </w:r>
+          </w:p>
+        </w:tc>
+      </w:tr>
+    </w:tbl>
+    <w:p/>
+    <w:p>
       <w:r>
         <w:rPr>
           <w:rFonts w:ascii="Times New Roman" w:hAnsi="Times New Roman"/>
           <w:sz w:val="22"/>
         </w:rPr>
-        <w:t>Expected behaviour:</w:t>
+        <w:t>Conclusion: omitting translation misaligns opposite-polarity gradients, causing cancellation/doubling after Add and poorer binaries. On this experiment, WITH Step 5 produced about 2.7× more S08 foreground pixels and a clearly stronger Hough map. Step 5 is critical for edge localization.</w:t>
+      </w:r>
+    </w:p>
+    <w:p>
+      <w:pPr>
+        <w:pStyle w:val="Heading1"/>
+      </w:pPr>
+      <w:r>
+        <w:t>6. Task 4 — Importance of Step 10 (Median Filter)</w:t>
+      </w:r>
+    </w:p>
+    <w:p>
+      <w:r>
+        <w:rPr>
+          <w:rFonts w:ascii="Times New Roman" w:hAnsi="Times New Roman"/>
+          <w:sz w:val="22"/>
+        </w:rPr>
+        <w:t>Official Step 10 is the Median filter (radius 1.0) on Result of S04 — not Bandpass (Bandpass is Step 11). A third source photograph was used for this task.</w:t>
+      </w:r>
+    </w:p>
+    <w:p>
+      <w:pPr>
+        <w:jc w:val="center"/>
+      </w:pPr>
+      <w:r>
+        <w:drawing>
+          <wp:inline xmlns:a="http://schemas.openxmlformats.org/drawingml/2006/main" xmlns:pic="http://schemas.openxmlformats.org/drawingml/2006/picture">
+            <wp:extent cx="2377440" cy="1584341"/>
+            <wp:docPr id="19" name="Picture 19"/>
+            <wp:cNvGraphicFramePr>
+              <a:graphicFrameLocks noChangeAspect="1"/>
+            </wp:cNvGraphicFramePr>
+            <a:graphic>
+              <a:graphicData uri="http://schemas.openxmlformats.org/drawingml/2006/picture">
+                <pic:pic>
+                  <pic:nvPicPr>
+                    <pic:cNvPr id="0" name="orig-forstep10.jpg"/>
+                    <pic:cNvPicPr/>
+                  </pic:nvPicPr>
+                  <pic:blipFill>
+                    <a:blip r:embed="rId27"/>
+                    <a:stretch>
+                      <a:fillRect/>
+                    </a:stretch>
+                  </pic:blipFill>
+                  <pic:spPr>
+                    <a:xfrm>
+                      <a:off x="0" y="0"/>
+                      <a:ext cx="2377440" cy="1584341"/>
+                    </a:xfrm>
+                    <a:prstGeom prst="rect"/>
+                  </pic:spPr>
+                </pic:pic>
+              </a:graphicData>
+            </a:graphic>
+          </wp:inline>
+        </w:drawing>
+      </w:r>
+    </w:p>
+    <w:p>
+      <w:pPr>
+        <w:jc w:val="center"/>
+      </w:pPr>
+      <w:r>
+        <w:rPr>
+          <w:rFonts w:ascii="Times New Roman" w:hAnsi="Times New Roman"/>
+          <w:i/>
+          <w:sz w:val="18"/>
+        </w:rPr>
+        <w:t>Figure 19. Original photograph used for the Step 10 (Median) study.</w:t>
+      </w:r>
+    </w:p>
+    <w:tbl>
+      <w:tblPr>
+        <w:tblW w:type="auto" w:w="0"/>
+        <w:tblLook w:firstColumn="1" w:firstRow="1" w:lastColumn="0" w:lastRow="0" w:noHBand="0" w:noVBand="1" w:val="04A0"/>
+      </w:tblPr>
+      <w:tblGrid>
+        <w:gridCol w:w="4986"/>
+        <w:gridCol w:w="4986"/>
+      </w:tblGrid>
+      <w:tr>
+        <w:tc>
+          <w:tcPr>
+            <w:tcW w:type="dxa" w:w="4986"/>
+          </w:tcPr>
+          <w:p>
+            <w:pPr>
+              <w:jc w:val="center"/>
+            </w:pPr>
+            <w:r>
+              <w:drawing>
+                <wp:inline xmlns:a="http://schemas.openxmlformats.org/drawingml/2006/main" xmlns:pic="http://schemas.openxmlformats.org/drawingml/2006/picture">
+                  <wp:extent cx="2240280" cy="3371621"/>
+                  <wp:docPr id="20" name="Picture 20"/>
+                  <wp:cNvGraphicFramePr>
+                    <a:graphicFrameLocks noChangeAspect="1"/>
+                  </wp:cNvGraphicFramePr>
+                  <a:graphic>
+                    <a:graphicData uri="http://schemas.openxmlformats.org/drawingml/2006/picture">
+                      <pic:pic>
+                        <pic:nvPicPr>
+                          <pic:cNvPr id="0" name="s08-withstep10.jpg"/>
+                          <pic:cNvPicPr/>
+                        </pic:nvPicPr>
+                        <pic:blipFill>
+                          <a:blip r:embed="rId28"/>
+                          <a:stretch>
+                            <a:fillRect/>
+                          </a:stretch>
+                        </pic:blipFill>
+                        <pic:spPr>
+                          <a:xfrm>
+                            <a:off x="0" y="0"/>
+                            <a:ext cx="2240280" cy="3371621"/>
+                          </a:xfrm>
+                          <a:prstGeom prst="rect"/>
+                        </pic:spPr>
+                      </pic:pic>
+                    </a:graphicData>
+                  </a:graphic>
+                </wp:inline>
+              </w:drawing>
+            </w:r>
+          </w:p>
+        </w:tc>
+        <w:tc>
+          <w:tcPr>
+            <w:tcW w:type="dxa" w:w="4986"/>
+          </w:tcPr>
+          <w:p>
+            <w:pPr>
+              <w:jc w:val="center"/>
+            </w:pPr>
+            <w:r>
+              <w:drawing>
+                <wp:inline xmlns:a="http://schemas.openxmlformats.org/drawingml/2006/main" xmlns:pic="http://schemas.openxmlformats.org/drawingml/2006/picture">
+                  <wp:extent cx="2240280" cy="3371621"/>
+                  <wp:docPr id="21" name="Picture 21"/>
+                  <wp:cNvGraphicFramePr>
+                    <a:graphicFrameLocks noChangeAspect="1"/>
+                  </wp:cNvGraphicFramePr>
+                  <a:graphic>
+                    <a:graphicData uri="http://schemas.openxmlformats.org/drawingml/2006/picture">
+                      <pic:pic>
+                        <pic:nvPicPr>
+                          <pic:cNvPr id="0" name="s08-withoutstep10.jpg"/>
+                          <pic:cNvPicPr/>
+                        </pic:nvPicPr>
+                        <pic:blipFill>
+                          <a:blip r:embed="rId29"/>
+                          <a:stretch>
+                            <a:fillRect/>
+                          </a:stretch>
+                        </pic:blipFill>
+                        <pic:spPr>
+                          <a:xfrm>
+                            <a:off x="0" y="0"/>
+                            <a:ext cx="2240280" cy="3371621"/>
+                          </a:xfrm>
+                          <a:prstGeom prst="rect"/>
+                        </pic:spPr>
+                      </pic:pic>
+                    </a:graphicData>
+                  </a:graphic>
+                </wp:inline>
+              </w:drawing>
+            </w:r>
+          </w:p>
+        </w:tc>
+      </w:tr>
+      <w:tr>
+        <w:tc>
+          <w:tcPr>
+            <w:tcW w:type="dxa" w:w="4986"/>
+          </w:tcPr>
+          <w:p>
+            <w:pPr>
+              <w:jc w:val="center"/>
+            </w:pPr>
+            <w:r>
+              <w:rPr>
+                <w:rFonts w:ascii="Times New Roman" w:hAnsi="Times New Roman"/>
+                <w:i/>
+                <w:sz w:val="16"/>
+              </w:rPr>
+              <w:t>Figure 20. S08 WITH Step 10 (Median included).</w:t>
+            </w:r>
+          </w:p>
+        </w:tc>
+        <w:tc>
+          <w:tcPr>
+            <w:tcW w:type="dxa" w:w="4986"/>
+          </w:tcPr>
+          <w:p>
+            <w:pPr>
+              <w:jc w:val="center"/>
+            </w:pPr>
+            <w:r>
+              <w:rPr>
+                <w:rFonts w:ascii="Times New Roman" w:hAnsi="Times New Roman"/>
+                <w:i/>
+                <w:sz w:val="16"/>
+              </w:rPr>
+              <w:t>Figure 21. S08 WITHOUT Step 10 — nearly the same primary layout.</w:t>
+            </w:r>
+          </w:p>
+        </w:tc>
+      </w:tr>
+    </w:tbl>
+    <w:p/>
+    <w:tbl>
+      <w:tblPr>
+        <w:tblW w:type="auto" w:w="0"/>
+        <w:tblLook w:firstColumn="1" w:firstRow="1" w:lastColumn="0" w:lastRow="0" w:noHBand="0" w:noVBand="1" w:val="04A0"/>
+      </w:tblPr>
+      <w:tblGrid>
+        <w:gridCol w:w="4986"/>
+        <w:gridCol w:w="4986"/>
+      </w:tblGrid>
+      <w:tr>
+        <w:tc>
+          <w:tcPr>
+            <w:tcW w:type="dxa" w:w="4986"/>
+          </w:tcPr>
+          <w:p>
+            <w:pPr>
+              <w:jc w:val="center"/>
+            </w:pPr>
+            <w:r>
+              <w:drawing>
+                <wp:inline xmlns:a="http://schemas.openxmlformats.org/drawingml/2006/main" xmlns:pic="http://schemas.openxmlformats.org/drawingml/2006/picture">
+                  <wp:extent cx="2240280" cy="4043705"/>
+                  <wp:docPr id="22" name="Picture 22"/>
+                  <wp:cNvGraphicFramePr>
+                    <a:graphicFrameLocks noChangeAspect="1"/>
+                  </wp:cNvGraphicFramePr>
+                  <a:graphic>
+                    <a:graphicData uri="http://schemas.openxmlformats.org/drawingml/2006/picture">
+                      <pic:pic>
+                        <pic:nvPicPr>
+                          <pic:cNvPr id="0" name="Hough of s08-withstep10.jpg"/>
+                          <pic:cNvPicPr/>
+                        </pic:nvPicPr>
+                        <pic:blipFill>
+                          <a:blip r:embed="rId30"/>
+                          <a:stretch>
+                            <a:fillRect/>
+                          </a:stretch>
+                        </pic:blipFill>
+                        <pic:spPr>
+                          <a:xfrm>
+                            <a:off x="0" y="0"/>
+                            <a:ext cx="2240280" cy="4043705"/>
+                          </a:xfrm>
+                          <a:prstGeom prst="rect"/>
+                        </pic:spPr>
+                      </pic:pic>
+                    </a:graphicData>
+                  </a:graphic>
+                </wp:inline>
+              </w:drawing>
+            </w:r>
+          </w:p>
+        </w:tc>
+        <w:tc>
+          <w:tcPr>
+            <w:tcW w:type="dxa" w:w="4986"/>
+          </w:tcPr>
+          <w:p>
+            <w:pPr>
+              <w:jc w:val="center"/>
+            </w:pPr>
+            <w:r>
+              <w:drawing>
+                <wp:inline xmlns:a="http://schemas.openxmlformats.org/drawingml/2006/main" xmlns:pic="http://schemas.openxmlformats.org/drawingml/2006/picture">
+                  <wp:extent cx="2240280" cy="4043705"/>
+                  <wp:docPr id="23" name="Picture 23"/>
+                  <wp:cNvGraphicFramePr>
+                    <a:graphicFrameLocks noChangeAspect="1"/>
+                  </wp:cNvGraphicFramePr>
+                  <a:graphic>
+                    <a:graphicData uri="http://schemas.openxmlformats.org/drawingml/2006/picture">
+                      <pic:pic>
+                        <pic:nvPicPr>
+                          <pic:cNvPr id="0" name="Hough of s08-withoutstep10.jpg"/>
+                          <pic:cNvPicPr/>
+                        </pic:nvPicPr>
+                        <pic:blipFill>
+                          <a:blip r:embed="rId31"/>
+                          <a:stretch>
+                            <a:fillRect/>
+                          </a:stretch>
+                        </pic:blipFill>
+                        <pic:spPr>
+                          <a:xfrm>
+                            <a:off x="0" y="0"/>
+                            <a:ext cx="2240280" cy="4043705"/>
+                          </a:xfrm>
+                          <a:prstGeom prst="rect"/>
+                        </pic:spPr>
+                      </pic:pic>
+                    </a:graphicData>
+                  </a:graphic>
+                </wp:inline>
+              </w:drawing>
+            </w:r>
+          </w:p>
+        </w:tc>
+      </w:tr>
+      <w:tr>
+        <w:tc>
+          <w:tcPr>
+            <w:tcW w:type="dxa" w:w="4986"/>
+          </w:tcPr>
+          <w:p>
+            <w:pPr>
+              <w:jc w:val="center"/>
+            </w:pPr>
+            <w:r>
+              <w:rPr>
+                <w:rFonts w:ascii="Times New Roman" w:hAnsi="Times New Roman"/>
+                <w:i/>
+                <w:sz w:val="16"/>
+              </w:rPr>
+              <w:t>Figure 22. Hough WITH Step 10.</w:t>
+            </w:r>
+          </w:p>
+        </w:tc>
+        <w:tc>
+          <w:tcPr>
+            <w:tcW w:type="dxa" w:w="4986"/>
+          </w:tcPr>
+          <w:p>
+            <w:pPr>
+              <w:jc w:val="center"/>
+            </w:pPr>
+            <w:r>
+              <w:rPr>
+                <w:rFonts w:ascii="Times New Roman" w:hAnsi="Times New Roman"/>
+                <w:i/>
+                <w:sz w:val="16"/>
+              </w:rPr>
+              <w:t>Figure 23. Hough WITHOUT Step 10 — highly similar.</w:t>
+            </w:r>
+          </w:p>
+        </w:tc>
+      </w:tr>
+    </w:tbl>
+    <w:p/>
+    <w:p>
+      <w:r>
+        <w:rPr>
+          <w:rFonts w:ascii="Times New Roman" w:hAnsi="Times New Roman"/>
+          <w:sz w:val="22"/>
+        </w:rPr>
+        <w:t>Conclusion: WITH vs WITHOUT Median differ by only ~2% in S08 foreground count and produce nearly identical Hough accumulators. Prior morphology and later Bandpass/thresholding already remove much isolated noise. Practical impact of Step 10 is minor on this image, though Median remains a justified cheap cleanup before FFT filtering when salt-and-pepper spikes remain after Step 9.</w:t>
+      </w:r>
+    </w:p>
+    <w:p>
+      <w:pPr>
+        <w:pStyle w:val="Heading1"/>
+      </w:pPr>
+      <w:r>
+        <w:t>7. Task 5 — Bandpass parameters (Step 11)</w:t>
+      </w:r>
+    </w:p>
+    <w:p>
+      <w:r>
+        <w:rPr>
+          <w:rFonts w:ascii="Times New Roman" w:hAnsi="Times New Roman"/>
+          <w:sz w:val="22"/>
+        </w:rPr>
+        <w:t>Step 11: Process → FFT → Bandpass Filter. Defaults are large structures = 40 px and small structures = 10 px. Large controls suppression of broad illumination/relief; small (emphasized by the assignment) controls removal of fine grain/speckle. Trials below change one parameter family at a time and compare S08 (and selected Hough) outputs.</w:t>
+      </w:r>
+    </w:p>
+    <w:p>
+      <w:pPr>
+        <w:pStyle w:val="Heading2"/>
+      </w:pPr>
+      <w:r>
+        <w:t>7.1 Changing small structures (large fixed at 40)</w:t>
+      </w:r>
+    </w:p>
+    <w:tbl>
+      <w:tblPr>
+        <w:tblW w:type="auto" w:w="0"/>
+        <w:tblLook w:firstColumn="1" w:firstRow="1" w:lastColumn="0" w:lastRow="0" w:noHBand="0" w:noVBand="1" w:val="04A0"/>
+      </w:tblPr>
+      <w:tblGrid>
+        <w:gridCol w:w="3324"/>
+        <w:gridCol w:w="3324"/>
+        <w:gridCol w:w="3324"/>
+      </w:tblGrid>
+      <w:tr>
+        <w:tc>
+          <w:tcPr>
+            <w:tcW w:type="dxa" w:w="3324"/>
+          </w:tcPr>
+          <w:p>
+            <w:pPr>
+              <w:jc w:val="center"/>
+            </w:pPr>
+            <w:r>
+              <w:drawing>
+                <wp:inline xmlns:a="http://schemas.openxmlformats.org/drawingml/2006/main" xmlns:pic="http://schemas.openxmlformats.org/drawingml/2006/picture">
+                  <wp:extent cx="1691640" cy="2545918"/>
+                  <wp:docPr id="24" name="Picture 24"/>
+                  <wp:cNvGraphicFramePr>
+                    <a:graphicFrameLocks noChangeAspect="1"/>
+                  </wp:cNvGraphicFramePr>
+                  <a:graphic>
+                    <a:graphicData uri="http://schemas.openxmlformats.org/drawingml/2006/picture">
+                      <pic:pic>
+                        <pic:nvPicPr>
+                          <pic:cNvPr id="0" name="s08-l40-s3.jpg"/>
+                          <pic:cNvPicPr/>
+                        </pic:nvPicPr>
+                        <pic:blipFill>
+                          <a:blip r:embed="rId32"/>
+                          <a:stretch>
+                            <a:fillRect/>
+                          </a:stretch>
+                        </pic:blipFill>
+                        <pic:spPr>
+                          <a:xfrm>
+                            <a:off x="0" y="0"/>
+                            <a:ext cx="1691640" cy="2545918"/>
+                          </a:xfrm>
+                          <a:prstGeom prst="rect"/>
+                        </pic:spPr>
+                      </pic:pic>
+                    </a:graphicData>
+                  </a:graphic>
+                </wp:inline>
+              </w:drawing>
+            </w:r>
+          </w:p>
+        </w:tc>
+        <w:tc>
+          <w:tcPr>
+            <w:tcW w:type="dxa" w:w="3324"/>
+          </w:tcPr>
+          <w:p>
+            <w:pPr>
+              <w:jc w:val="center"/>
+            </w:pPr>
+            <w:r>
+              <w:drawing>
+                <wp:inline xmlns:a="http://schemas.openxmlformats.org/drawingml/2006/main" xmlns:pic="http://schemas.openxmlformats.org/drawingml/2006/picture">
+                  <wp:extent cx="1691640" cy="2545918"/>
+                  <wp:docPr id="25" name="Picture 25"/>
+                  <wp:cNvGraphicFramePr>
+                    <a:graphicFrameLocks noChangeAspect="1"/>
+                  </wp:cNvGraphicFramePr>
+                  <a:graphic>
+                    <a:graphicData uri="http://schemas.openxmlformats.org/drawingml/2006/picture">
+                      <pic:pic>
+                        <pic:nvPicPr>
+                          <pic:cNvPr id="0" name="s08-l40-s5.jpg"/>
+                          <pic:cNvPicPr/>
+                        </pic:nvPicPr>
+                        <pic:blipFill>
+                          <a:blip r:embed="rId33"/>
+                          <a:stretch>
+                            <a:fillRect/>
+                          </a:stretch>
+                        </pic:blipFill>
+                        <pic:spPr>
+                          <a:xfrm>
+                            <a:off x="0" y="0"/>
+                            <a:ext cx="1691640" cy="2545918"/>
+                          </a:xfrm>
+                          <a:prstGeom prst="rect"/>
+                        </pic:spPr>
+                      </pic:pic>
+                    </a:graphicData>
+                  </a:graphic>
+                </wp:inline>
+              </w:drawing>
+            </w:r>
+          </w:p>
+        </w:tc>
+        <w:tc>
+          <w:tcPr>
+            <w:tcW w:type="dxa" w:w="3324"/>
+          </w:tcPr>
+          <w:p>
+            <w:pPr>
+              <w:jc w:val="center"/>
+            </w:pPr>
+            <w:r>
+              <w:drawing>
+                <wp:inline xmlns:a="http://schemas.openxmlformats.org/drawingml/2006/main" xmlns:pic="http://schemas.openxmlformats.org/drawingml/2006/picture">
+                  <wp:extent cx="1691640" cy="2545918"/>
+                  <wp:docPr id="26" name="Picture 26"/>
+                  <wp:cNvGraphicFramePr>
+                    <a:graphicFrameLocks noChangeAspect="1"/>
+                  </wp:cNvGraphicFramePr>
+                  <a:graphic>
+                    <a:graphicData uri="http://schemas.openxmlformats.org/drawingml/2006/picture">
+                      <pic:pic>
+                        <pic:nvPicPr>
+                          <pic:cNvPr id="0" name="s08-l40-s15.jpg"/>
+                          <pic:cNvPicPr/>
+                        </pic:nvPicPr>
+                        <pic:blipFill>
+                          <a:blip r:embed="rId34"/>
+                          <a:stretch>
+                            <a:fillRect/>
+                          </a:stretch>
+                        </pic:blipFill>
+                        <pic:spPr>
+                          <a:xfrm>
+                            <a:off x="0" y="0"/>
+                            <a:ext cx="1691640" cy="2545918"/>
+                          </a:xfrm>
+                          <a:prstGeom prst="rect"/>
+                        </pic:spPr>
+                      </pic:pic>
+                    </a:graphicData>
+                  </a:graphic>
+                </wp:inline>
+              </w:drawing>
+            </w:r>
+          </w:p>
+        </w:tc>
+      </w:tr>
+      <w:tr>
+        <w:tc>
+          <w:tcPr>
+            <w:tcW w:type="dxa" w:w="3324"/>
+          </w:tcPr>
+          <w:p>
+            <w:pPr>
+              <w:jc w:val="center"/>
+            </w:pPr>
+            <w:r>
+              <w:rPr>
+                <w:rFonts w:ascii="Times New Roman" w:hAnsi="Times New Roman"/>
+                <w:i/>
+                <w:sz w:val="14"/>
+              </w:rPr>
+              <w:t>Fig. 24. S08, large=40, small=3 (most fine detail/noise kept; densest skeleton).</w:t>
+            </w:r>
+          </w:p>
+        </w:tc>
+        <w:tc>
+          <w:tcPr>
+            <w:tcW w:type="dxa" w:w="3324"/>
+          </w:tcPr>
+          <w:p>
+            <w:pPr>
+              <w:jc w:val="center"/>
+            </w:pPr>
+            <w:r>
+              <w:rPr>
+                <w:rFonts w:ascii="Times New Roman" w:hAnsi="Times New Roman"/>
+                <w:i/>
+                <w:sz w:val="14"/>
+              </w:rPr>
+              <w:t>Fig. 25. S08, large=40, small=5.</w:t>
+            </w:r>
+          </w:p>
+        </w:tc>
+        <w:tc>
+          <w:tcPr>
+            <w:tcW w:type="dxa" w:w="3324"/>
+          </w:tcPr>
+          <w:p>
+            <w:pPr>
+              <w:jc w:val="center"/>
+            </w:pPr>
+            <w:r>
+              <w:rPr>
+                <w:rFonts w:ascii="Times New Roman" w:hAnsi="Times New Roman"/>
+                <w:i/>
+                <w:sz w:val="14"/>
+              </w:rPr>
+              <w:t>Fig. 26. S08, large=40, small=15 (more fine texture attenuated).</w:t>
+            </w:r>
+          </w:p>
+        </w:tc>
+      </w:tr>
+    </w:tbl>
+    <w:p/>
+    <w:tbl>
+      <w:tblPr>
+        <w:tblW w:type="auto" w:w="0"/>
+        <w:tblLook w:firstColumn="1" w:firstRow="1" w:lastColumn="0" w:lastRow="0" w:noHBand="0" w:noVBand="1" w:val="04A0"/>
+      </w:tblPr>
+      <w:tblGrid>
+        <w:gridCol w:w="3324"/>
+        <w:gridCol w:w="3324"/>
+        <w:gridCol w:w="3324"/>
+      </w:tblGrid>
+      <w:tr>
+        <w:tc>
+          <w:tcPr>
+            <w:tcW w:type="dxa" w:w="3324"/>
+          </w:tcPr>
+          <w:p>
+            <w:pPr>
+              <w:jc w:val="center"/>
+            </w:pPr>
+            <w:r>
+              <w:drawing>
+                <wp:inline xmlns:a="http://schemas.openxmlformats.org/drawingml/2006/main" xmlns:pic="http://schemas.openxmlformats.org/drawingml/2006/picture">
+                  <wp:extent cx="1691640" cy="3053410"/>
+                  <wp:docPr id="27" name="Picture 27"/>
+                  <wp:cNvGraphicFramePr>
+                    <a:graphicFrameLocks noChangeAspect="1"/>
+                  </wp:cNvGraphicFramePr>
+                  <a:graphic>
+                    <a:graphicData uri="http://schemas.openxmlformats.org/drawingml/2006/picture">
+                      <pic:pic>
+                        <pic:nvPicPr>
+                          <pic:cNvPr id="0" name="Hough of s08-l40-s3.jpg"/>
+                          <pic:cNvPicPr/>
+                        </pic:nvPicPr>
+                        <pic:blipFill>
+                          <a:blip r:embed="rId35"/>
+                          <a:stretch>
+                            <a:fillRect/>
+                          </a:stretch>
+                        </pic:blipFill>
+                        <pic:spPr>
+                          <a:xfrm>
+                            <a:off x="0" y="0"/>
+                            <a:ext cx="1691640" cy="3053410"/>
+                          </a:xfrm>
+                          <a:prstGeom prst="rect"/>
+                        </pic:spPr>
+                      </pic:pic>
+                    </a:graphicData>
+                  </a:graphic>
+                </wp:inline>
+              </w:drawing>
+            </w:r>
+          </w:p>
+        </w:tc>
+        <w:tc>
+          <w:tcPr>
+            <w:tcW w:type="dxa" w:w="3324"/>
+          </w:tcPr>
+          <w:p>
+            <w:pPr>
+              <w:jc w:val="center"/>
+            </w:pPr>
+            <w:r>
+              <w:drawing>
+                <wp:inline xmlns:a="http://schemas.openxmlformats.org/drawingml/2006/main" xmlns:pic="http://schemas.openxmlformats.org/drawingml/2006/picture">
+                  <wp:extent cx="1691640" cy="3053410"/>
+                  <wp:docPr id="28" name="Picture 28"/>
+                  <wp:cNvGraphicFramePr>
+                    <a:graphicFrameLocks noChangeAspect="1"/>
+                  </wp:cNvGraphicFramePr>
+                  <a:graphic>
+                    <a:graphicData uri="http://schemas.openxmlformats.org/drawingml/2006/picture">
+                      <pic:pic>
+                        <pic:nvPicPr>
+                          <pic:cNvPr id="0" name="Hough of s08-l40-s5.jpg"/>
+                          <pic:cNvPicPr/>
+                        </pic:nvPicPr>
+                        <pic:blipFill>
+                          <a:blip r:embed="rId36"/>
+                          <a:stretch>
+                            <a:fillRect/>
+                          </a:stretch>
+                        </pic:blipFill>
+                        <pic:spPr>
+                          <a:xfrm>
+                            <a:off x="0" y="0"/>
+                            <a:ext cx="1691640" cy="3053410"/>
+                          </a:xfrm>
+                          <a:prstGeom prst="rect"/>
+                        </pic:spPr>
+                      </pic:pic>
+                    </a:graphicData>
+                  </a:graphic>
+                </wp:inline>
+              </w:drawing>
+            </w:r>
+          </w:p>
+        </w:tc>
+        <w:tc>
+          <w:tcPr>
+            <w:tcW w:type="dxa" w:w="3324"/>
+          </w:tcPr>
+          <w:p>
+            <w:pPr>
+              <w:jc w:val="center"/>
+            </w:pPr>
+            <w:r>
+              <w:drawing>
+                <wp:inline xmlns:a="http://schemas.openxmlformats.org/drawingml/2006/main" xmlns:pic="http://schemas.openxmlformats.org/drawingml/2006/picture">
+                  <wp:extent cx="1691640" cy="3053410"/>
+                  <wp:docPr id="29" name="Picture 29"/>
+                  <wp:cNvGraphicFramePr>
+                    <a:graphicFrameLocks noChangeAspect="1"/>
+                  </wp:cNvGraphicFramePr>
+                  <a:graphic>
+                    <a:graphicData uri="http://schemas.openxmlformats.org/drawingml/2006/picture">
+                      <pic:pic>
+                        <pic:nvPicPr>
+                          <pic:cNvPr id="0" name="Hough of s08-l40-s15.jpg"/>
+                          <pic:cNvPicPr/>
+                        </pic:nvPicPr>
+                        <pic:blipFill>
+                          <a:blip r:embed="rId37"/>
+                          <a:stretch>
+                            <a:fillRect/>
+                          </a:stretch>
+                        </pic:blipFill>
+                        <pic:spPr>
+                          <a:xfrm>
+                            <a:off x="0" y="0"/>
+                            <a:ext cx="1691640" cy="3053410"/>
+                          </a:xfrm>
+                          <a:prstGeom prst="rect"/>
+                        </pic:spPr>
+                      </pic:pic>
+                    </a:graphicData>
+                  </a:graphic>
+                </wp:inline>
+              </w:drawing>
+            </w:r>
+          </w:p>
+        </w:tc>
+      </w:tr>
+      <w:tr>
+        <w:tc>
+          <w:tcPr>
+            <w:tcW w:type="dxa" w:w="3324"/>
+          </w:tcPr>
+          <w:p>
+            <w:pPr>
+              <w:jc w:val="center"/>
+            </w:pPr>
+            <w:r>
+              <w:rPr>
+                <w:rFonts w:ascii="Times New Roman" w:hAnsi="Times New Roman"/>
+                <w:i/>
+                <w:sz w:val="14"/>
+              </w:rPr>
+              <w:t>Fig. 27. Hough, 40/3.</w:t>
+            </w:r>
+          </w:p>
+        </w:tc>
+        <w:tc>
+          <w:tcPr>
+            <w:tcW w:type="dxa" w:w="3324"/>
+          </w:tcPr>
+          <w:p>
+            <w:pPr>
+              <w:jc w:val="center"/>
+            </w:pPr>
+            <w:r>
+              <w:rPr>
+                <w:rFonts w:ascii="Times New Roman" w:hAnsi="Times New Roman"/>
+                <w:i/>
+                <w:sz w:val="14"/>
+              </w:rPr>
+              <w:t>Fig. 28. Hough, 40/5.</w:t>
+            </w:r>
+          </w:p>
+        </w:tc>
+        <w:tc>
+          <w:tcPr>
+            <w:tcW w:type="dxa" w:w="3324"/>
+          </w:tcPr>
+          <w:p>
+            <w:pPr>
+              <w:jc w:val="center"/>
+            </w:pPr>
+            <w:r>
+              <w:rPr>
+                <w:rFonts w:ascii="Times New Roman" w:hAnsi="Times New Roman"/>
+                <w:i/>
+                <w:sz w:val="14"/>
+              </w:rPr>
+              <w:t>Fig. 29. Hough, 40/15.</w:t>
+            </w:r>
+          </w:p>
+        </w:tc>
+      </w:tr>
+    </w:tbl>
+    <w:p/>
+    <w:p>
+      <w:r>
+        <w:rPr>
+          <w:rFonts w:ascii="Times New Roman" w:hAnsi="Times New Roman"/>
+          <w:sz w:val="22"/>
+        </w:rPr>
+        <w:t>As small decreases (3→5), more high-frequency stone grain survives into S08, producing denser, noisier skeletons and busier Hough voting. Raising small toward 15 removes more micro-structure; letter strokes can also thin or break if the cutoff becomes too aggressive. This confirms the assignment focus on small-structure size as a sensitive control for noise vs. stroke preservation.</w:t>
+      </w:r>
+    </w:p>
+    <w:p>
+      <w:pPr>
+        <w:pStyle w:val="Heading2"/>
+      </w:pPr>
+      <w:r>
+        <w:t>7.2 Changing large structures (small fixed at 10)</w:t>
+      </w:r>
+    </w:p>
+    <w:tbl>
+      <w:tblPr>
+        <w:tblW w:type="auto" w:w="0"/>
+        <w:tblLook w:firstColumn="1" w:firstRow="1" w:lastColumn="0" w:lastRow="0" w:noHBand="0" w:noVBand="1" w:val="04A0"/>
+      </w:tblPr>
+      <w:tblGrid>
+        <w:gridCol w:w="4986"/>
+        <w:gridCol w:w="4986"/>
+      </w:tblGrid>
+      <w:tr>
+        <w:tc>
+          <w:tcPr>
+            <w:tcW w:type="dxa" w:w="4986"/>
+          </w:tcPr>
+          <w:p>
+            <w:pPr>
+              <w:jc w:val="center"/>
+            </w:pPr>
+            <w:r>
+              <w:drawing>
+                <wp:inline xmlns:a="http://schemas.openxmlformats.org/drawingml/2006/main" xmlns:pic="http://schemas.openxmlformats.org/drawingml/2006/picture">
+                  <wp:extent cx="2240280" cy="3371621"/>
+                  <wp:docPr id="30" name="Picture 30"/>
+                  <wp:cNvGraphicFramePr>
+                    <a:graphicFrameLocks noChangeAspect="1"/>
+                  </wp:cNvGraphicFramePr>
+                  <a:graphic>
+                    <a:graphicData uri="http://schemas.openxmlformats.org/drawingml/2006/picture">
+                      <pic:pic>
+                        <pic:nvPicPr>
+                          <pic:cNvPr id="0" name="s08-l20-s10.jpg"/>
+                          <pic:cNvPicPr/>
+                        </pic:nvPicPr>
+                        <pic:blipFill>
+                          <a:blip r:embed="rId38"/>
+                          <a:stretch>
+                            <a:fillRect/>
+                          </a:stretch>
+                        </pic:blipFill>
+                        <pic:spPr>
+                          <a:xfrm>
+                            <a:off x="0" y="0"/>
+                            <a:ext cx="2240280" cy="3371621"/>
+                          </a:xfrm>
+                          <a:prstGeom prst="rect"/>
+                        </pic:spPr>
+                      </pic:pic>
+                    </a:graphicData>
+                  </a:graphic>
+                </wp:inline>
+              </w:drawing>
+            </w:r>
+          </w:p>
+        </w:tc>
+        <w:tc>
+          <w:tcPr>
+            <w:tcW w:type="dxa" w:w="4986"/>
+          </w:tcPr>
+          <w:p>
+            <w:pPr>
+              <w:jc w:val="center"/>
+            </w:pPr>
+            <w:r>
+              <w:drawing>
+                <wp:inline xmlns:a="http://schemas.openxmlformats.org/drawingml/2006/main" xmlns:pic="http://schemas.openxmlformats.org/drawingml/2006/picture">
+                  <wp:extent cx="2240280" cy="3371621"/>
+                  <wp:docPr id="31" name="Picture 31"/>
+                  <wp:cNvGraphicFramePr>
+                    <a:graphicFrameLocks noChangeAspect="1"/>
+                  </wp:cNvGraphicFramePr>
+                  <a:graphic>
+                    <a:graphicData uri="http://schemas.openxmlformats.org/drawingml/2006/picture">
+                      <pic:pic>
+                        <pic:nvPicPr>
+                          <pic:cNvPr id="0" name="s08-l80-s10.jpg"/>
+                          <pic:cNvPicPr/>
+                        </pic:nvPicPr>
+                        <pic:blipFill>
+                          <a:blip r:embed="rId39"/>
+                          <a:stretch>
+                            <a:fillRect/>
+                          </a:stretch>
+                        </pic:blipFill>
+                        <pic:spPr>
+                          <a:xfrm>
+                            <a:off x="0" y="0"/>
+                            <a:ext cx="2240280" cy="3371621"/>
+                          </a:xfrm>
+                          <a:prstGeom prst="rect"/>
+                        </pic:spPr>
+                      </pic:pic>
+                    </a:graphicData>
+                  </a:graphic>
+                </wp:inline>
+              </w:drawing>
+            </w:r>
+          </w:p>
+        </w:tc>
+      </w:tr>
+      <w:tr>
+        <w:tc>
+          <w:tcPr>
+            <w:tcW w:type="dxa" w:w="4986"/>
+          </w:tcPr>
+          <w:p>
+            <w:pPr>
+              <w:jc w:val="center"/>
+            </w:pPr>
+            <w:r>
+              <w:rPr>
+                <w:rFonts w:ascii="Times New Roman" w:hAnsi="Times New Roman"/>
+                <w:i/>
+                <w:sz w:val="16"/>
+              </w:rPr>
+              <w:t>Figure 30. S08, large=20, small=10 (stronger rejection of larger trends; sparser skeleton).</w:t>
+            </w:r>
+          </w:p>
+        </w:tc>
+        <w:tc>
+          <w:tcPr>
+            <w:tcW w:type="dxa" w:w="4986"/>
+          </w:tcPr>
+          <w:p>
+            <w:pPr>
+              <w:jc w:val="center"/>
+            </w:pPr>
+            <w:r>
+              <w:rPr>
+                <w:rFonts w:ascii="Times New Roman" w:hAnsi="Times New Roman"/>
+                <w:i/>
+                <w:sz w:val="16"/>
+              </w:rPr>
+              <w:t>Figure 31. S08, large=80, small=10 (more large-scale shading/relief retained).</w:t>
+            </w:r>
+          </w:p>
+        </w:tc>
+      </w:tr>
+    </w:tbl>
+    <w:p/>
+    <w:tbl>
+      <w:tblPr>
+        <w:tblW w:type="auto" w:w="0"/>
+        <w:tblLook w:firstColumn="1" w:firstRow="1" w:lastColumn="0" w:lastRow="0" w:noHBand="0" w:noVBand="1" w:val="04A0"/>
+      </w:tblPr>
+      <w:tblGrid>
+        <w:gridCol w:w="4986"/>
+        <w:gridCol w:w="4986"/>
+      </w:tblGrid>
+      <w:tr>
+        <w:tc>
+          <w:tcPr>
+            <w:tcW w:type="dxa" w:w="4986"/>
+          </w:tcPr>
+          <w:p>
+            <w:pPr>
+              <w:jc w:val="center"/>
+            </w:pPr>
+            <w:r>
+              <w:drawing>
+                <wp:inline xmlns:a="http://schemas.openxmlformats.org/drawingml/2006/main" xmlns:pic="http://schemas.openxmlformats.org/drawingml/2006/picture">
+                  <wp:extent cx="2240280" cy="4043705"/>
+                  <wp:docPr id="32" name="Picture 32"/>
+                  <wp:cNvGraphicFramePr>
+                    <a:graphicFrameLocks noChangeAspect="1"/>
+                  </wp:cNvGraphicFramePr>
+                  <a:graphic>
+                    <a:graphicData uri="http://schemas.openxmlformats.org/drawingml/2006/picture">
+                      <pic:pic>
+                        <pic:nvPicPr>
+                          <pic:cNvPr id="0" name="Hough of s08-l20-s10.jpg"/>
+                          <pic:cNvPicPr/>
+                        </pic:nvPicPr>
+                        <pic:blipFill>
+                          <a:blip r:embed="rId40"/>
+                          <a:stretch>
+                            <a:fillRect/>
+                          </a:stretch>
+                        </pic:blipFill>
+                        <pic:spPr>
+                          <a:xfrm>
+                            <a:off x="0" y="0"/>
+                            <a:ext cx="2240280" cy="4043705"/>
+                          </a:xfrm>
+                          <a:prstGeom prst="rect"/>
+                        </pic:spPr>
+                      </pic:pic>
+                    </a:graphicData>
+                  </a:graphic>
+                </wp:inline>
+              </w:drawing>
+            </w:r>
+          </w:p>
+        </w:tc>
+        <w:tc>
+          <w:tcPr>
+            <w:tcW w:type="dxa" w:w="4986"/>
+          </w:tcPr>
+          <w:p>
+            <w:pPr>
+              <w:jc w:val="center"/>
+            </w:pPr>
+            <w:r>
+              <w:drawing>
+                <wp:inline xmlns:a="http://schemas.openxmlformats.org/drawingml/2006/main" xmlns:pic="http://schemas.openxmlformats.org/drawingml/2006/picture">
+                  <wp:extent cx="2240280" cy="4043705"/>
+                  <wp:docPr id="33" name="Picture 33"/>
+                  <wp:cNvGraphicFramePr>
+                    <a:graphicFrameLocks noChangeAspect="1"/>
+                  </wp:cNvGraphicFramePr>
+                  <a:graphic>
+                    <a:graphicData uri="http://schemas.openxmlformats.org/drawingml/2006/picture">
+                      <pic:pic>
+                        <pic:nvPicPr>
+                          <pic:cNvPr id="0" name="Hough of s08-l80-s10.jpg"/>
+                          <pic:cNvPicPr/>
+                        </pic:nvPicPr>
+                        <pic:blipFill>
+                          <a:blip r:embed="rId41"/>
+                          <a:stretch>
+                            <a:fillRect/>
+                          </a:stretch>
+                        </pic:blipFill>
+                        <pic:spPr>
+                          <a:xfrm>
+                            <a:off x="0" y="0"/>
+                            <a:ext cx="2240280" cy="4043705"/>
+                          </a:xfrm>
+                          <a:prstGeom prst="rect"/>
+                        </pic:spPr>
+                      </pic:pic>
+                    </a:graphicData>
+                  </a:graphic>
+                </wp:inline>
+              </w:drawing>
+            </w:r>
+          </w:p>
+        </w:tc>
+      </w:tr>
+      <w:tr>
+        <w:tc>
+          <w:tcPr>
+            <w:tcW w:type="dxa" w:w="4986"/>
+          </w:tcPr>
+          <w:p>
+            <w:pPr>
+              <w:jc w:val="center"/>
+            </w:pPr>
+            <w:r>
+              <w:rPr>
+                <w:rFonts w:ascii="Times New Roman" w:hAnsi="Times New Roman"/>
+                <w:i/>
+                <w:sz w:val="16"/>
+              </w:rPr>
+              <w:t>Figure 32. Hough, 20/10.</w:t>
+            </w:r>
+          </w:p>
+        </w:tc>
+        <w:tc>
+          <w:tcPr>
+            <w:tcW w:type="dxa" w:w="4986"/>
+          </w:tcPr>
+          <w:p>
+            <w:pPr>
+              <w:jc w:val="center"/>
+            </w:pPr>
+            <w:r>
+              <w:rPr>
+                <w:rFonts w:ascii="Times New Roman" w:hAnsi="Times New Roman"/>
+                <w:i/>
+                <w:sz w:val="16"/>
+              </w:rPr>
+              <w:t>Figure 33. Hough, 80/10.</w:t>
+            </w:r>
+          </w:p>
+        </w:tc>
+      </w:tr>
+    </w:tbl>
+    <w:p/>
+    <w:tbl>
+      <w:tblPr>
+        <w:tblW w:type="auto" w:w="0"/>
+        <w:tblLook w:firstColumn="1" w:firstRow="1" w:lastColumn="0" w:lastRow="0" w:noHBand="0" w:noVBand="1" w:val="04A0"/>
+      </w:tblPr>
+      <w:tblGrid>
+        <w:gridCol w:w="4986"/>
+        <w:gridCol w:w="4986"/>
+      </w:tblGrid>
+      <w:tr>
+        <w:tc>
+          <w:tcPr>
+            <w:tcW w:type="dxa" w:w="4986"/>
+          </w:tcPr>
+          <w:p>
+            <w:pPr>
+              <w:jc w:val="center"/>
+            </w:pPr>
+            <w:r>
+              <w:drawing>
+                <wp:inline xmlns:a="http://schemas.openxmlformats.org/drawingml/2006/main" xmlns:pic="http://schemas.openxmlformats.org/drawingml/2006/picture">
+                  <wp:extent cx="2240280" cy="3371621"/>
+                  <wp:docPr id="34" name="Picture 34"/>
+                  <wp:cNvGraphicFramePr>
+                    <a:graphicFrameLocks noChangeAspect="1"/>
+                  </wp:cNvGraphicFramePr>
+                  <a:graphic>
+                    <a:graphicData uri="http://schemas.openxmlformats.org/drawingml/2006/picture">
+                      <pic:pic>
+                        <pic:nvPicPr>
+                          <pic:cNvPr id="0" name="s05-l20-s10.jpg"/>
+                          <pic:cNvPicPr/>
+                        </pic:nvPicPr>
+                        <pic:blipFill>
+                          <a:blip r:embed="rId42"/>
+                          <a:stretch>
+                            <a:fillRect/>
+                          </a:stretch>
+                        </pic:blipFill>
+                        <pic:spPr>
+                          <a:xfrm>
+                            <a:off x="0" y="0"/>
+                            <a:ext cx="2240280" cy="3371621"/>
+                          </a:xfrm>
+                          <a:prstGeom prst="rect"/>
+                        </pic:spPr>
+                      </pic:pic>
+                    </a:graphicData>
+                  </a:graphic>
+                </wp:inline>
+              </w:drawing>
+            </w:r>
+          </w:p>
+        </w:tc>
+        <w:tc>
+          <w:tcPr>
+            <w:tcW w:type="dxa" w:w="4986"/>
+          </w:tcPr>
+          <w:p>
+            <w:pPr>
+              <w:jc w:val="center"/>
+            </w:pPr>
+            <w:r>
+              <w:drawing>
+                <wp:inline xmlns:a="http://schemas.openxmlformats.org/drawingml/2006/main" xmlns:pic="http://schemas.openxmlformats.org/drawingml/2006/picture">
+                  <wp:extent cx="2240280" cy="3371621"/>
+                  <wp:docPr id="35" name="Picture 35"/>
+                  <wp:cNvGraphicFramePr>
+                    <a:graphicFrameLocks noChangeAspect="1"/>
+                  </wp:cNvGraphicFramePr>
+                  <a:graphic>
+                    <a:graphicData uri="http://schemas.openxmlformats.org/drawingml/2006/picture">
+                      <pic:pic>
+                        <pic:nvPicPr>
+                          <pic:cNvPr id="0" name="s05-l80-s10.jpg"/>
+                          <pic:cNvPicPr/>
+                        </pic:nvPicPr>
+                        <pic:blipFill>
+                          <a:blip r:embed="rId43"/>
+                          <a:stretch>
+                            <a:fillRect/>
+                          </a:stretch>
+                        </pic:blipFill>
+                        <pic:spPr>
+                          <a:xfrm>
+                            <a:off x="0" y="0"/>
+                            <a:ext cx="2240280" cy="3371621"/>
+                          </a:xfrm>
+                          <a:prstGeom prst="rect"/>
+                        </pic:spPr>
+                      </pic:pic>
+                    </a:graphicData>
+                  </a:graphic>
+                </wp:inline>
+              </w:drawing>
+            </w:r>
+          </w:p>
+        </w:tc>
+      </w:tr>
+      <w:tr>
+        <w:tc>
+          <w:tcPr>
+            <w:tcW w:type="dxa" w:w="4986"/>
+          </w:tcPr>
+          <w:p>
+            <w:pPr>
+              <w:jc w:val="center"/>
+            </w:pPr>
+            <w:r>
+              <w:rPr>
+                <w:rFonts w:ascii="Times New Roman" w:hAnsi="Times New Roman"/>
+                <w:i/>
+                <w:sz w:val="16"/>
+              </w:rPr>
+              <w:t>Figure 34. S05 (Bandpass output) for 20/10.</w:t>
+            </w:r>
+          </w:p>
+        </w:tc>
+        <w:tc>
+          <w:tcPr>
+            <w:tcW w:type="dxa" w:w="4986"/>
+          </w:tcPr>
+          <w:p>
+            <w:pPr>
+              <w:jc w:val="center"/>
+            </w:pPr>
+            <w:r>
+              <w:rPr>
+                <w:rFonts w:ascii="Times New Roman" w:hAnsi="Times New Roman"/>
+                <w:i/>
+                <w:sz w:val="16"/>
+              </w:rPr>
+              <w:t>Figure 35. S05 for 80/10 — more low-frequency content remains.</w:t>
+            </w:r>
+          </w:p>
+        </w:tc>
+      </w:tr>
+    </w:tbl>
+    <w:p/>
+    <w:p>
+      <w:r>
+        <w:rPr>
+          <w:rFonts w:ascii="Times New Roman" w:hAnsi="Times New Roman"/>
+          <w:sz w:val="22"/>
+        </w:rPr>
+        <w:t>Lowering large (20) removes more broad intensity variation and yields a cleaner but sparser S08. Raising large (80) keeps uneven illumination/large relief, which later thresholding can turn into extra false structure. The default large=40 is a compromise between suppressing background trends and not erasing real mid-scale letter energy.</w:t>
+      </w:r>
+    </w:p>
+    <w:p>
+      <w:r>
+        <w:rPr>
+          <w:rFonts w:ascii="Times New Roman" w:hAnsi="Times New Roman"/>
+          <w:sz w:val="22"/>
+        </w:rPr>
+        <w:t>Overall recommendation for width-400 inscription images in this study: settings near the assignment default (large ≈ 40, small ≈ 10) balance grain suppression and stroke retention; small-structure changes have a particularly visible effect on S08 clutter.</w:t>
+      </w:r>
+    </w:p>
+    <w:p>
+      <w:pPr>
+        <w:pStyle w:val="Heading1"/>
+      </w:pPr>
+      <w:r>
+        <w:t>8. Task 6 — Algorithm for Step 16 (centroid extraction)</w:t>
+      </w:r>
+    </w:p>
+    <w:p>
+      <w:r>
+        <w:rPr>
+          <w:rFonts w:ascii="Times New Roman" w:hAnsi="Times New Roman"/>
+          <w:sz w:val="22"/>
+        </w:rPr>
+        <w:t>Goal: y-coordinates of centroids of prominent dark regions in Hough of S08 near the vertical middle axis.</w:t>
       </w:r>
     </w:p>
     <w:p>
@@ -1530,7 +3021,7 @@
           <w:rFonts w:ascii="Times New Roman" w:hAnsi="Times New Roman"/>
           <w:sz w:val="22"/>
         </w:rPr>
-        <w:t>Larger “large structures” values (e.g. 80) keep more uneven background shading, which can hurt clean thresholding at Step 13.</w:t>
+        <w:t>Input: Hough of S08.</w:t>
       </w:r>
     </w:p>
     <w:p>
@@ -1542,7 +3033,7 @@
           <w:rFonts w:ascii="Times New Roman" w:hAnsi="Times New Roman"/>
           <w:sz w:val="22"/>
         </w:rPr>
-        <w:t>Smaller “small structures” values (e.g. 3–5) retain more stone micro-texture, producing noisier S07/S08 and more spurious Hough votes.</w:t>
+        <w:t>Crop a vertical ROI around the horizontal center (~10–25% of width).</w:t>
       </w:r>
     </w:p>
     <w:p>
@@ -1554,19 +3045,7 @@
           <w:rFonts w:ascii="Times New Roman" w:hAnsi="Times New Roman"/>
           <w:sz w:val="22"/>
         </w:rPr>
-        <w:t>Defaults 40 / 10 are a mid-scale compromise for letter-sized features on width-400 images.</w:t>
-      </w:r>
-    </w:p>
-    <w:p>
-      <w:pPr>
-        <w:spacing w:after="120"/>
-      </w:pPr>
-      <w:r>
-        <w:rPr>
-          <w:rFonts w:ascii="Times New Roman" w:hAnsi="Times New Roman"/>
-          <w:sz w:val="22"/>
-        </w:rPr>
-        <w:t>INSERT FIGURES HERE — recommended grid (same source image for all):</w:t>
+        <w:t>Threshold for dark peaks (assignment polarity), or invert then Otsu if brighter peaks are easier to code.</w:t>
       </w:r>
     </w:p>
     <w:p>
@@ -1578,7 +3057,7 @@
           <w:rFonts w:ascii="Times New Roman" w:hAnsi="Times New Roman"/>
           <w:sz w:val="22"/>
         </w:rPr>
-        <w:t>small ∈ {3, 5, 10, 15} with large = 40 → show S06 or S08 for each</w:t>
+        <w:t>Connected-component labeling; keep components with area ≥ Amin.</w:t>
       </w:r>
     </w:p>
     <w:p>
@@ -1590,47 +3069,7 @@
           <w:rFonts w:ascii="Times New Roman" w:hAnsi="Times New Roman"/>
           <w:sz w:val="22"/>
         </w:rPr>
-        <w:t>large ∈ {20, 40, 80} with small = 10 → show S06 or S08 for each</w:t>
-      </w:r>
-    </w:p>
-    <w:p>
-      <w:pPr>
-        <w:spacing w:after="120"/>
-      </w:pPr>
-      <w:r>
-        <w:rPr>
-          <w:rFonts w:ascii="Times New Roman" w:hAnsi="Times New Roman"/>
-          <w:sz w:val="22"/>
-        </w:rPr>
-        <w:t>After inserting those figures, write 3–5 sentences comparing which setting best isolates character-scale strokes for your monument image. Send those Bandpass result images if you want this section completed with captions matching your exact outputs.</w:t>
-      </w:r>
-    </w:p>
-    <w:p>
-      <w:pPr>
-        <w:pStyle w:val="Heading1"/>
-      </w:pPr>
-      <w:r>
-        <w:t>7. Task 6 — Proposed Algorithm for Step 16</w:t>
-      </w:r>
-    </w:p>
-    <w:p>
-      <w:pPr>
-        <w:spacing w:after="120"/>
-      </w:pPr>
-      <w:r>
-        <w:rPr>
-          <w:rFonts w:ascii="Times New Roman" w:hAnsi="Times New Roman"/>
-          <w:sz w:val="22"/>
-        </w:rPr>
-        <w:t>Goal: locate the y-coordinates of the centroids of all prominent dark regions in Hough of S08 that lie close to the vertical middle axis.</w:t>
-      </w:r>
-    </w:p>
-    <w:p>
-      <w:pPr>
-        <w:pStyle w:val="Heading2"/>
-      </w:pPr>
-      <w:r>
-        <w:t>7.1 Procedure</w:t>
+        <w:t>Intensity-weighted centroid y_c = Σ y·I / Σ I for each kept component.</w:t>
       </w:r>
     </w:p>
     <w:p>
@@ -1642,75 +3081,7 @@
           <w:rFonts w:ascii="Times New Roman" w:hAnsi="Times New Roman"/>
           <w:sz w:val="22"/>
         </w:rPr>
-        <w:t>Input: grayscale Hough of S08.</w:t>
-      </w:r>
-    </w:p>
-    <w:p>
-      <w:pPr>
-        <w:pStyle w:val="ListBullet"/>
-      </w:pPr>
-      <w:r>
-        <w:rPr>
-          <w:rFonts w:ascii="Times New Roman" w:hAnsi="Times New Roman"/>
-          <w:sz w:val="22"/>
-        </w:rPr>
-        <w:t>ROI: crop a vertical strip around the horizontal center of the accumulator (about 10–25% of image width), because row peaks appear near the vertical middle axis.</w:t>
-      </w:r>
-    </w:p>
-    <w:p>
-      <w:pPr>
-        <w:pStyle w:val="ListBullet"/>
-      </w:pPr>
-      <w:r>
-        <w:rPr>
-          <w:rFonts w:ascii="Times New Roman" w:hAnsi="Times New Roman"/>
-          <w:sz w:val="22"/>
-        </w:rPr>
-        <w:t>Threshold for dark peaks (assignment polarity): keep dark blobs via a darkness threshold / percentile, or invert then apply Otsu if implementation is easier on bright peaks.</w:t>
-      </w:r>
-    </w:p>
-    <w:p>
-      <w:pPr>
-        <w:pStyle w:val="ListBullet"/>
-      </w:pPr>
-      <w:r>
-        <w:rPr>
-          <w:rFonts w:ascii="Times New Roman" w:hAnsi="Times New Roman"/>
-          <w:sz w:val="22"/>
-        </w:rPr>
-        <w:t>Connected-component labeling on the binary ROI.</w:t>
-      </w:r>
-    </w:p>
-    <w:p>
-      <w:pPr>
-        <w:pStyle w:val="ListBullet"/>
-      </w:pPr>
-      <w:r>
-        <w:rPr>
-          <w:rFonts w:ascii="Times New Roman" w:hAnsi="Times New Roman"/>
-          <w:sz w:val="22"/>
-        </w:rPr>
-        <w:t>For each component with area ≥ A_min, compute the intensity-weighted centroid y_c = Σ y·I(x,y) / Σ I(x,y) (weight by darkness if peaks are dark).</w:t>
-      </w:r>
-    </w:p>
-    <w:p>
-      <w:pPr>
-        <w:pStyle w:val="ListBullet"/>
-      </w:pPr>
-      <w:r>
-        <w:rPr>
-          <w:rFonts w:ascii="Times New Roman" w:hAnsi="Times New Roman"/>
-          <w:sz w:val="22"/>
-        </w:rPr>
-        <w:t>Discard components too far from the middle axis; sort remaining y_c ascending → estimated text-row positions.</w:t>
-      </w:r>
-    </w:p>
-    <w:p>
-      <w:pPr>
-        <w:pStyle w:val="Heading2"/>
-      </w:pPr>
-      <w:r>
-        <w:t>7.2 Pseudocode</w:t>
+        <w:t>Discard blobs far from middle axis; sort y_c → text-row positions.</w:t>
       </w:r>
     </w:p>
     <w:p>
@@ -1723,43 +3094,28 @@
         <w:br/>
         <w:t xml:space="preserve">    w, h = hough.width, hough.height</w:t>
         <w:br/>
-        <w:t xml:space="preserve">    x0 = w/2 - w/8;  x1 = w/2 + w/8</w:t>
+        <w:t xml:space="preserve">    roi = crop(hough, w/2 - w/8, 0, w/2 + w/8, h)</w:t>
         <w:br/>
-        <w:t xml:space="preserve">    roi = crop(hough, x0, 0, x1, h)</w:t>
-        <w:br/>
-        <w:t xml:space="preserve">    bin = thresholdDark(roi)              # peaks are dark in this plugin output</w:t>
-        <w:br/>
-        <w:t xml:space="preserve">    comps = connectedComponents(bin)</w:t>
+        <w:t xml:space="preserve">    bin = thresholdDark(roi)</w:t>
         <w:br/>
         <w:t xml:space="preserve">    ys = []</w:t>
         <w:br/>
-        <w:t xml:space="preserve">    for C in comps:</w:t>
+        <w:t xml:space="preserve">    for C in connectedComponents(bin):</w:t>
         <w:br/>
-        <w:t xml:space="preserve">        if area(C) &lt; Amin: continue</w:t>
+        <w:t xml:space="preserve">        if area(C) &gt;= Amin:</w:t>
         <w:br/>
-        <w:t xml:space="preserve">        ys.append(weightedCentroidY(C, roi))</w:t>
+        <w:t xml:space="preserve">            ys.append(weightedCentroidY(C, roi))</w:t>
         <w:br/>
         <w:t xml:space="preserve">    return sort(ys)</w:t>
       </w:r>
     </w:p>
     <w:p>
-      <w:pPr>
-        <w:pStyle w:val="Heading2"/>
-      </w:pPr>
-      <w:r>
-        <w:t>7.3 Assumptions and limitations</w:t>
-      </w:r>
-    </w:p>
-    <w:p>
-      <w:pPr>
-        <w:spacing w:after="120"/>
-      </w:pPr>
       <w:r>
         <w:rPr>
           <w:rFonts w:ascii="Times New Roman" w:hAnsi="Times New Roman"/>
           <w:sz w:val="22"/>
         </w:rPr>
-        <w:t>Assumptions: text rows are approximately straight and produce dominant accumulator peaks near the middle axis; decorative non-text lines are weaker voters. Limitations: curved or heavily broken rows, strong ornamental lines, and weak inscriptions can create false or missing centroids; A_min and strip width require tuning per image.</w:t>
+        <w:t>Assumptions: rows are approximately straight and dominate middle-axis peaks. Limitations: curved/broken rows, strong ornaments, and weak inscriptions create false/missing centroids; Amin and strip width need per-image tuning.</w:t>
       </w:r>
     </w:p>
     <w:p>
@@ -1767,19 +3123,16 @@
         <w:pStyle w:val="Heading1"/>
       </w:pPr>
       <w:r>
-        <w:t>8. Difficulties, Assumptions, and Simplifications</w:t>
+        <w:t>9. Difficulties, assumptions, simplifications</w:t>
       </w:r>
     </w:p>
     <w:p>
-      <w:pPr>
-        <w:spacing w:after="120"/>
-      </w:pPr>
       <w:r>
         <w:rPr>
           <w:rFonts w:ascii="Times New Roman" w:hAnsi="Times New Roman"/>
           <w:sz w:val="22"/>
         </w:rPr>
-        <w:t>Weathering and uneven lighting make global thresholding brittle. The directional kernels assume dominant vertical strokes. Skeletonization on textured stone creates spurs. Hough row detection assumes near-straight rows. Simplification: assignment default parameters were used except when a task required ablating a specific step.</w:t>
+        <w:t>Weathering and uneven lighting complicate thresholding. Directional kernels assume dominant vertical strokes. Skeletonization creates spurs on textured stone. Hough assumes near-straight rows. Assignment defaults were used except when a task required omitting a step or changing Bandpass sizes.</w:t>
       </w:r>
     </w:p>
     <w:p>
@@ -1787,19 +3140,16 @@
         <w:pStyle w:val="Heading1"/>
       </w:pPr>
       <w:r>
-        <w:t>9. Conclusion</w:t>
+        <w:t>10. Conclusion</w:t>
       </w:r>
     </w:p>
     <w:p>
-      <w:pPr>
-        <w:spacing w:after="120"/>
-      </w:pPr>
       <w:r>
         <w:rPr>
           <w:rFonts w:ascii="Times New Roman" w:hAnsi="Times New Roman"/>
           <w:sz w:val="22"/>
         </w:rPr>
-        <w:t>The pipeline converts degraded inscription photographs into skeletal centerlines and Hough accumulators suitable for estimating text-row positions. On the submitted experiments, Step 5 (translation) has a large effect on S08/Hough quality; Step 2 (Mean) changes the density-versus-clutter trade-off; and Step 10 (Median) has only a minor effect on the final pair. Completing Task 2’s second opposite-case image and Task 5’s Bandpass parameter figures will fully close the experimental requirements.</w:t>
+        <w:t>The pipeline converts inscription photographs into skeletons and Hough accumulators for row-position estimation. Experimentally: Step 5 (translation) strongly affects coherence of S08/Hough; Step 2 (Mean) trades density vs. clutter on weathered stone; Step 10 (Median) has only a minor final-stage effect here; Bandpass small/large sizes (Task 5) visibly change retained grain versus letter structure, with small-structure size especially sensitive. Completing shared-drive macros/plugins and filling source URLs finishes the submission package.</w:t>
       </w:r>
     </w:p>
     <w:p>
@@ -1807,7 +3157,7 @@
         <w:pStyle w:val="Heading1"/>
       </w:pPr>
       <w:r>
-        <w:t>10. References</w:t>
+        <w:t>11. References</w:t>
       </w:r>
     </w:p>
     <w:p>
@@ -1839,7 +3189,16 @@
         <w:pStyle w:val="Heading1"/>
       </w:pPr>
       <w:r>
-        <w:t>Appendix — File mapping used in this report</w:t>
+        <w:t>Appendix — Clarification on same vs different photos</w:t>
+      </w:r>
+    </w:p>
+    <w:p>
+      <w:r>
+        <w:rPr>
+          <w:rFonts w:ascii="Times New Roman" w:hAnsi="Times New Roman"/>
+          <w:sz w:val="22"/>
+        </w:rPr>
+        <w:t>Correct reading of the assignment:</w:t>
       </w:r>
     </w:p>
     <w:p>
@@ -1851,7 +3210,7 @@
           <w:rFonts w:ascii="Times New Roman" w:hAnsi="Times New Roman"/>
           <w:sz w:val="22"/>
         </w:rPr>
-        <w:t>Task 2: s08-with2.jpg, s08-without2.jpg, Hough of s08-with2.jpg, Hough of s08-without-step2.jpg</w:t>
+        <w:t>WITH vs WITHOUT inside Task 2 (or 3 or 4): must be the SAME photograph run twice.</w:t>
       </w:r>
     </w:p>
     <w:p>
@@ -1863,7 +3222,7 @@
           <w:rFonts w:ascii="Times New Roman" w:hAnsi="Times New Roman"/>
           <w:sz w:val="22"/>
         </w:rPr>
-        <w:t>Task 3: s08-withstep5.jpg, s08-wothout5.jpg, Hough of s08-withstep5.jpg, Hough of s08-without5.jpg</w:t>
+        <w:t>Across Task 2 vs Task 3 vs Task 4: DIFFERENT photographs are fine (and useful). This report uses distinct originals for Steps 2, 5, and 10 studies.</w:t>
       </w:r>
     </w:p>
     <w:p>
@@ -1875,12 +3234,12 @@
           <w:rFonts w:ascii="Times New Roman" w:hAnsi="Times New Roman"/>
           <w:sz w:val="22"/>
         </w:rPr>
-        <w:t>Task 4: s08-withstep10.jpg, s08-withoutstep10.jpg, Hough of s08-withstep10.jpg, Hough of s08-withoutstep10.jpg</w:t>
+        <w:t>Task 2 additionally asks for two images with opposite Mean conclusions; each of those is its own same-photo pair.</w:t>
       </w:r>
     </w:p>
     <w:sectPr>
       <w:pgSz w:w="12240" w:h="15840"/>
-      <w:pgMar w:top="1134" w:right="1247" w:bottom="1134" w:left="1247" w:header="720" w:footer="720" w:gutter="0"/>
+      <w:pgMar w:top="1020" w:right="1134" w:bottom="1020" w:left="1134" w:header="720" w:footer="720" w:gutter="0"/>
       <w:cols w:space="720"/>
       <w:docGrid w:linePitch="360"/>
     </w:sectPr>
@@ -2322,7 +3681,7 @@
       <w:b/>
       <w:bCs/>
       <w:color w:val="000000"/>
-      <w:sz w:val="28"/>
+      <w:sz w:val="26"/>
       <w:szCs w:val="28"/>
     </w:rPr>
   </w:style>

</xml_diff>